<commit_message>
add instant refresh and other things
</commit_message>
<xml_diff>
--- a/Specification Documentation/Recipe_Book_Functional_Specification.docx
+++ b/Specification Documentation/Recipe_Book_Functional_Specification.docx
@@ -20,12 +20,12 @@
     </w:p>
     <w:p>
       <w:r>
-        <w:t xml:space="preserve">User-facing requirements for the iPad app and website: recipe page layout, ways to add recipes, and acceptance criteria</w:t>
+        <w:t xml:space="preserve">User-facing requirements for the Recipe Book website, used on the iPad from the Home Screen: screens, ways to add recipes, the kitchen features, and acceptance criteria</w:t>
       </w:r>
     </w:p>
     <w:p>
       <w:r>
-        <w:t xml:space="preserve">Version 1.1  |  October 27, 2026  |  Document status: Living specification (source of truth)</w:t>
+        <w:t xml:space="preserve">Version 2.0  |  October 29, 2026  |  Document status: Living specification (source of truth)</w:t>
       </w:r>
     </w:p>
     <w:tbl>
@@ -106,7 +106,7 @@
               <w:rPr>
                 <w:sz w:val="16"/>
               </w:rPr>
-              <w:t xml:space="preserve">Recipe Book: a native iPad app (installed with SideStore) and a website (https://ramiyas-recipes.vercel.app), sharing one database</w:t>
+              <w:t xml:space="preserve">Recipe Book: a website (https://ramiyas-recipes.vercel.app), used mainly in Safari on the owner's iPad from a Home Screen shortcut, with the Apple Pencil</w:t>
             </w:r>
           </w:p>
         </w:tc>
@@ -178,7 +178,7 @@
               <w:rPr>
                 <w:sz w:val="16"/>
               </w:rPr>
-              <w:t xml:space="preserve">Home book shelf, Library, Recipe view, Book page (writing page), Add a recipe (from the web, from photos, enter your own), Search and tag filters, Groceries, Start Cooking, Serving scaler, iPad app install and refresh, Print, Website Home Screen install and offline</w:t>
+              <w:t xml:space="preserve">Home (pick up, this week's meals, groceries at a glance, to finish), Library (list and book), Recipe view, Writing page (lines and Pencil page mode), Save from the web, Add from photos, Paste text, Groceries, Start Cooking, Serving scaler, Favorites, Offline, Live updates, Settings</w:t>
             </w:r>
           </w:p>
         </w:tc>
@@ -214,7 +214,43 @@
               <w:rPr>
                 <w:sz w:val="16"/>
               </w:rPr>
-              <w:t xml:space="preserve">Specified / Implemented (reported) / Deployed / Verification pending / Planned / Queued</w:t>
+              <w:t xml:space="preserve">Specified / Built (not deployed) / Deployed / Verification pending / Planned / Queued</w:t>
+            </w:r>
+          </w:p>
+        </w:tc>
+      </w:tr>
+      <w:tr>
+        <w:tc>
+          <w:tcPr>
+            <w:tcW w:type="dxa" w:w="2448"/>
+            <w:vAlign w:val="center"/>
+          </w:tcPr>
+          <w:p>
+            <w:pPr>
+              <w:spacing w:after="20"/>
+            </w:pPr>
+            <w:r>
+              <w:rPr>
+                <w:sz w:val="16"/>
+              </w:rPr>
+              <w:t xml:space="preserve">Primary browser</w:t>
+            </w:r>
+          </w:p>
+        </w:tc>
+        <w:tc>
+          <w:tcPr>
+            <w:tcW w:type="dxa" w:w="6768"/>
+            <w:vAlign w:val="center"/>
+          </w:tcPr>
+          <w:p>
+            <w:pPr>
+              <w:spacing w:after="20"/>
+            </w:pPr>
+            <w:r>
+              <w:rPr>
+                <w:sz w:val="16"/>
+              </w:rPr>
+              <w:t xml:space="preserve">Safari on iPad (iPadOS 18 and later). Other browsers are supported but secondary.</w:t>
             </w:r>
           </w:p>
         </w:tc>
@@ -231,12 +267,12 @@
     </w:p>
     <w:p>
       <w:r>
-        <w:t xml:space="preserve">This document defines the expected user experience and behavior of the Recipe Book: a personal recipe book styled after the owner's handwritten spiral recipe book. It has two parts that share one database: a native iPad app, which is the main way to add and cook from recipes, and a website for family, other devices, and as a fallback. It is intended to guide implementation, regression testing, and change review. The Technical Specification remains the reference for Next.js, SwiftUI, Supabase, the data model, and deployment. The reference photo of the book page is docs/reference/recipe-book-page.jpg; the plans are docs/PLAN.md (website) and docs/APP_PLAN.md (iPad app).</w:t>
+        <w:t xml:space="preserve">This document defines the expected user experience and behavior of the Recipe Book: a personal recipe book styled after the owner's handwritten spiral recipe book. It is a website that everyone can read and only the owner's unlocked devices can change. On the iPad it is used from a Home Screen shortcut, with Scribble and the Apple Pencil. A native iPad app was planned, built as a prototype in the Simulator and dropped on 2026-10-29 (Section 14); its features are covered by the website. The Technical Specification is the reference for Next.js, Supabase, the data model and deployment. The reference photo of the book page is docs/reference/recipe-book-page.jpg; the look and screens are in docs/DESIGN.md; the current state and next steps are in docs/HANDOFF.md.</w:t>
       </w:r>
     </w:p>
     <w:p>
       <w:r>
-        <w:t xml:space="preserve">A requirement in this document is an expected outcome, not proof that the deployed application currently meets it. Items that were discussed or coded but not verified by the owner are explicitly identified. Planned requirements belong to a later website build step or iPad app phase; Queued requirements are agreed but not scheduled. The look and screens of both the website and the app follow docs/DESIGN.md (decided 2026-10-27, modeled on the Deglaze app).</w:t>
+        <w:t xml:space="preserve">A requirement is an expected outcome, not proof that the deployed site meets it. Each requirement says whether it is deployed, built but not yet deployed, or planned, and whether the owner has checked it. Automated checks run in WebKit (Safari's engine) with an iPad profile; they cannot reproduce the Apple Pencil, Scribble or the on-screen keyboard, so those need the owner's check.</w:t>
       </w:r>
     </w:p>
     <w:p>
@@ -252,22 +288,22 @@
         <w:pStyle w:val="Heading2"/>
       </w:pPr>
       <w:r>
-        <w:t xml:space="preserve">FR-ACCESS-001  Anyone can read; only the owner's devices can save</w:t>
+        <w:t xml:space="preserve">FR-ACCESS-001  Anyone can read; only unlocked devices can change anything</w:t>
       </w:r>
     </w:p>
     <w:p>
       <w:r>
-        <w:t xml:space="preserve">There is no login (deferred and on the docket). Every recipe can be read by anyone with the link. Saving, deleting, uploading and changing the grocery list require a private write key. The owner enters it once in the iPad app's Settings (kept in the iPad's secure storage) and once per browser in the website's Settings (Unlock editing, kept in a secure cookie for a year; Lock editing removes it). Editing buttons only appear on unlocked devices. Login (FR-AUTH-001) will replace the write key.</w:t>
+        <w:t xml:space="preserve">There is no login (queued, FR-AUTH-001). Anyone with the link can read every recipe, the week's meals and the grocery list. Saving, deleting, uploading, favorites, meals and grocery changes need the write key, entered once per browser in Settings (Unlock editing); it is kept in a secure cookie for a year, and Lock editing removes it. Editing buttons only appear on unlocked devices.</w:t>
       </w:r>
     </w:p>
     <w:p>
       <w:r>
-        <w:t xml:space="preserve">Acceptance: A request to save, delete or upload without the write key is refused and changes nothing; the same request with the write key succeeds; a locked browser shows no editing buttons.</w:t>
+        <w:t xml:space="preserve">Acceptance: Without the write key every change is refused and nothing changes; with it, changes succeed; a locked browser shows no + button, Edit, stars to tap or + Add on days.</w:t>
       </w:r>
     </w:p>
     <w:p>
       <w:r>
-        <w:t xml:space="preserve">Verification status: Deployed and verified 2026-10-27 by scripts/check-setup.sh against the live site (all checks pass) for the save function; website unlock planned (website step R2), app planned (Phase 2)</w:t>
+        <w:t xml:space="preserve">Verification status: Deployed and verified 2026-10-27 by scripts/check-setup.sh against the live site (all checks pass) for the save function; website unlock deployed 2026-10-28 and in use</w:t>
       </w:r>
     </w:p>
     <w:p>
@@ -275,22 +311,22 @@
         <w:pStyle w:val="Heading2"/>
       </w:pPr>
       <w:r>
-        <w:t xml:space="preserve">FR-NAV-001  Category tabs</w:t>
+        <w:t xml:space="preserve">FR-NAV-001  Navigation</w:t>
       </w:r>
     </w:p>
     <w:p>
       <w:r>
-        <w:t xml:space="preserve">Colored tabs match the side tabs of the book: Mains (mustard), Sides (orange), Desserts (dusty pink) and More Recipes (slate blue). On the recipe page they hang off the page's right edge as vertical tabs on screens 768px and wider, and become a horizontal strip above the page on phones. The cover always shows the horizontal strip. The current recipe's category tab sticks out further than the others.</w:t>
+        <w:t xml:space="preserve">Home, Library, Groceries and Settings: a bottom tab bar on phones and iPad portrait, a left sidebar on iPad landscape and desktops. A floating green + button (unlocked only) opens Add a recipe.</w:t>
       </w:r>
     </w:p>
     <w:p>
       <w:r>
-        <w:t xml:space="preserve">Acceptance: Selecting a tab opens /category/&lt;slug&gt; and lists only that category's recipes; an unknown category address shows the not-found page.</w:t>
+        <w:t xml:space="preserve">Acceptance: Each tab opens its page and is highlighted; the book view and recipe pages highlight Library.</w:t>
       </w:r>
     </w:p>
     <w:p>
       <w:r>
-        <w:t xml:space="preserve">Verification status: Deployed 2026-10-27 at https://ramiyas-recipes.vercel.app (commit f5b036c); compared with the reference photo in headless Chrome; owner verification pending; the tabs move to the Home book shelf (FR-HOME-001) in website step R1</w:t>
+        <w:t xml:space="preserve">Verification status: Deployed at https://ramiyas-recipes.vercel.app (main at 19be9f4, 2026-10-29); checked in WebKit with an iPad profile and in headless Chrome; owner check on the iPad pending</w:t>
       </w:r>
     </w:p>
     <w:p>
@@ -298,45 +334,22 @@
         <w:pStyle w:val="Heading2"/>
       </w:pPr>
       <w:r>
-        <w:t xml:space="preserve">FR-NAV-002  Cover and recipe grid</w:t>
+        <w:t xml:space="preserve">FR-NAV-002  Recipe web addresses</w:t>
       </w:r>
     </w:p>
     <w:p>
       <w:r>
-        <w:t xml:space="preserve">The home page is the book cover: a raspberry header with a thin white inner border and the word “recipes”, the category strip, and a grid of page-style recipe cards. Each card shows “recipe:” with the title in handwriting, a teal asterisk for family favorites, servings, total time, and the checked tags. Selecting a card opens the recipe page.</w:t>
+        <w:t xml:space="preserve">Each recipe has a readable address made from its title, such as /recipe/sweet-chili-chicken. Editing the title keeps the address; a second recipe with the same title gets a short code added. Old category addresses (/category/mains) lead to the Library with that category's filter on.</w:t>
       </w:r>
     </w:p>
     <w:p>
       <w:r>
-        <w:t xml:space="preserve">Acceptance: The sweet chili chicken card reads “Serves 4 · 60 min” and “Family Favorite”, shows the asterisk, and opens /recipe/sweet-chili-chicken.</w:t>
+        <w:t xml:space="preserve">Acceptance: Renaming keeps the address; /category/mains opens /library?category=mains.</w:t>
       </w:r>
     </w:p>
     <w:p>
       <w:r>
-        <w:t xml:space="preserve">Verification status: Deployed 2026-10-27 at https://ramiyas-recipes.vercel.app (commit f5b036c); compared with the reference photo in headless Chrome; owner verification pending; replaced by the Library (FR-LIB-001) in website step R1</w:t>
-      </w:r>
-    </w:p>
-    <w:p>
-      <w:pPr>
-        <w:pStyle w:val="Heading2"/>
-      </w:pPr>
-      <w:r>
-        <w:t xml:space="preserve">FR-NAV-003  Recipe web addresses</w:t>
-      </w:r>
-    </w:p>
-    <w:p>
-      <w:r>
-        <w:t xml:space="preserve">Each recipe has a readable address made from its title, such as /recipe/sweet-chili-chicken. Editing the title keeps the same address, so saved links keep working. If two recipes have the same title, the second gets a short code added to its address.</w:t>
-      </w:r>
-    </w:p>
-    <w:p>
-      <w:r>
-        <w:t xml:space="preserve">Acceptance: Renaming a recipe keeps its address; a second “sweet chili chicken” gets an address like /recipe/sweet-chili-chicken-1a2b3c4d.</w:t>
-      </w:r>
-    </w:p>
-    <w:p>
-      <w:r>
-        <w:t xml:space="preserve">Verification status: Implemented 2026-10-24 in the database (tested in a local Postgres); deployed 2026-10-27</w:t>
+        <w:t xml:space="preserve">Verification status: Addresses deployed 2026-10-27; category redirect Deployed at https://ramiyas-recipes.vercel.app (main at 19be9f4, 2026-10-29); checked in WebKit with an iPad profile and in headless Chrome; owner check on the iPad pending</w:t>
       </w:r>
     </w:p>
     <w:p>
@@ -349,17 +362,40 @@
     </w:p>
     <w:p>
       <w:r>
-        <w:t xml:space="preserve">A recipe saved or deleted on the iPad appears on (or disappears from) the website within about a minute, without a redeploy. Deleted recipes are hidden from the website and removed from the app the next time it syncs.</w:t>
+        <w:t xml:space="preserve">A change saved on one device shows on the device that saved it at once, and on every other open device within about a second (live updates, FR-LIVE-001). Deleted recipes disappear everywhere.</w:t>
       </w:r>
     </w:p>
     <w:p>
       <w:r>
-        <w:t xml:space="preserve">Acceptance: A deleted recipe's page shows not-found within about a minute.</w:t>
+        <w:t xml:space="preserve">Acceptance: With the recipe open on two devices, a save on one appears on the other without reloading.</w:t>
       </w:r>
     </w:p>
     <w:p>
       <w:r>
-        <w:t xml:space="preserve">Verification status: Website side deployed and verified 2026-10-27 (scripts/check-setup.sh saves and deletes a test recipe, and the live site hides it); to verify with the first save from the app</w:t>
+        <w:t xml:space="preserve">Verification status: Built 2026-10-29, not yet deployed; checked in WebKit with an iPad profile (and headless Chrome); owner check pending (live updates need migration 003)</w:t>
+      </w:r>
+    </w:p>
+    <w:p>
+      <w:pPr>
+        <w:pStyle w:val="Heading2"/>
+      </w:pPr>
+      <w:r>
+        <w:t xml:space="preserve">FR-HOME-SCREEN-001  Home Screen shortcut</w:t>
+      </w:r>
+    </w:p>
+    <w:p>
+      <w:r>
+        <w:t xml:space="preserve">Added to the iPad Home Screen (Share → Add to Home Screen), the site shows the whisk-and-wooden-spoon icon and the name “Ramiya’s Recipes”. It opens in Safari (full-screen standalone mode is a decision pending, FR-PWA-002).</w:t>
+      </w:r>
+    </w:p>
+    <w:p>
+      <w:r>
+        <w:t xml:space="preserve">Acceptance: A newly added shortcut shows the icon and the name with its space.</w:t>
+      </w:r>
+    </w:p>
+    <w:p>
+      <w:r>
+        <w:t xml:space="preserve">Verification status: Deployed at https://ramiyas-recipes.vercel.app (main at 19be9f4, 2026-10-29); checked in WebKit with an iPad profile and in headless Chrome; owner check on the iPad pending (re-add the shortcut to pick up the icon and name)</w:t>
       </w:r>
     </w:p>
     <w:p>
@@ -448,7 +484,7 @@
               <w:rPr>
                 <w:sz w:val="16"/>
               </w:rPr>
-              <w:t xml:space="preserve">Anything the cook wrote (title, amounts, ingredients, steps, notes, stat values). Always shown in the handwriting font in plum ink.</w:t>
+              <w:t xml:space="preserve">Anything the cook wrote (title, amounts, ingredients, steps, notes, stat values). Shown in the handwriting font (Patrick Hand, until the owner's own font) in plum ink.</w:t>
             </w:r>
           </w:p>
         </w:tc>
@@ -484,7 +520,7 @@
               <w:rPr>
                 <w:sz w:val="16"/>
               </w:rPr>
-              <w:t xml:space="preserve">Anything printed on the book's blank page (INGREDIENTS, DIRECTIONS, stat box headers, tag names, “recipe:”). Shown in small gray letter-spaced capitals, or the gray serif for “recipe:”.</w:t>
+              <w:t xml:space="preserve">Anything printed on the book's page (INGREDIENTS, DIRECTIONS, stat box headers, tag names, “recipe:”), in small gray capitals or the gray serif for “recipe:”.</w:t>
             </w:r>
           </w:p>
         </w:tc>
@@ -520,7 +556,7 @@
               <w:rPr>
                 <w:sz w:val="16"/>
               </w:rPr>
-              <w:t xml:space="preserve">A named set of ingredients such as “marinade” or “coconut lime drizzle”. A group with no name holds loose items such as “2 c cooked rice”.</w:t>
+              <w:t xml:space="preserve">A named set of ingredients such as “marinade”. A group with no name holds loose items.</w:t>
             </w:r>
           </w:p>
         </w:tc>
@@ -556,7 +592,43 @@
               <w:rPr>
                 <w:sz w:val="16"/>
               </w:rPr>
-              <w:t xml:space="preserve">A step is a ▷ line (“cook chicken”); sub-steps are the indented “–” lines under it.</w:t>
+              <w:t xml:space="preserve">A step is a ▷ line; sub-steps are the indented “–” lines under it.</w:t>
+            </w:r>
+          </w:p>
+        </w:tc>
+      </w:tr>
+      <w:tr>
+        <w:tc>
+          <w:tcPr>
+            <w:tcW w:type="dxa" w:w="2592"/>
+            <w:vAlign w:val="center"/>
+          </w:tcPr>
+          <w:p>
+            <w:pPr>
+              <w:spacing w:after="20"/>
+            </w:pPr>
+            <w:r>
+              <w:rPr>
+                <w:sz w:val="16"/>
+              </w:rPr>
+              <w:t xml:space="preserve">Tags</w:t>
+            </w:r>
+          </w:p>
+        </w:tc>
+        <w:tc>
+          <w:tcPr>
+            <w:tcW w:type="dxa" w:w="6624"/>
+            <w:vAlign w:val="center"/>
+          </w:tcPr>
+          <w:p>
+            <w:pPr>
+              <w:spacing w:after="20"/>
+            </w:pPr>
+            <w:r>
+              <w:rPr>
+                <w:sz w:val="16"/>
+              </w:rPr>
+              <w:t xml:space="preserve">Quick &amp; Easy, Slow Cooker, One Pot/Pan, Air Fryer, Veg (trimmed 2026-10-29). Older recipes may carry removed tags; they are kept but not shown.</w:t>
             </w:r>
           </w:p>
         </w:tc>
@@ -592,43 +664,7 @@
               <w:rPr>
                 <w:sz w:val="16"/>
               </w:rPr>
-              <w:t xml:space="preserve">A recipe with the Family Favorite tag checked. Marked with a teal asterisk.</w:t>
-            </w:r>
-          </w:p>
-        </w:tc>
-      </w:tr>
-      <w:tr>
-        <w:tc>
-          <w:tcPr>
-            <w:tcW w:type="dxa" w:w="2592"/>
-            <w:vAlign w:val="center"/>
-          </w:tcPr>
-          <w:p>
-            <w:pPr>
-              <w:spacing w:after="20"/>
-            </w:pPr>
-            <w:r>
-              <w:rPr>
-                <w:sz w:val="16"/>
-              </w:rPr>
-              <w:t xml:space="preserve">Total time</w:t>
-            </w:r>
-          </w:p>
-        </w:tc>
-        <w:tc>
-          <w:tcPr>
-            <w:tcW w:type="dxa" w:w="6624"/>
-            <w:vAlign w:val="center"/>
-          </w:tcPr>
-          <w:p>
-            <w:pPr>
-              <w:spacing w:after="20"/>
-            </w:pPr>
-            <w:r>
-              <w:rPr>
-                <w:sz w:val="16"/>
-              </w:rPr>
-              <w:t xml:space="preserve">Prep minutes plus cook minutes. A missing value counts as zero; if both are missing no time is shown.</w:t>
+              <w:t xml:space="preserve">Set with the star on a Library card. Favorites fill the Library's ★ Favorites filter and get a star on their card and an asterisk on the book page. Not a tag checkbox any more.</w:t>
             </w:r>
           </w:p>
         </w:tc>
@@ -664,7 +700,7 @@
               <w:rPr>
                 <w:sz w:val="16"/>
               </w:rPr>
-              <w:t xml:space="preserve">Amounts are kept exactly as the cook wrote them (“1/3”, “1 1/2”, or nothing for “pinch of salt”). The common fractions 1/2, 1/3, 2/3, 1/4 and 3/4 are displayed as ½ ⅓ ⅔ ¼ ¾. A parsed number is used only for scaling and is never shown instead of what was written.</w:t>
+              <w:t xml:space="preserve">Kept exactly as written (“1/3”, “1 1/2”, or nothing for “pinch of salt”); ½ ⅓ ⅔ ¼ ¾ shown for common fractions; the parsed number is only used for scaling.</w:t>
             </w:r>
           </w:p>
         </w:tc>
@@ -683,7 +719,7 @@
               <w:rPr>
                 <w:sz w:val="16"/>
               </w:rPr>
-              <w:t xml:space="preserve">Ruled line</w:t>
+              <w:t xml:space="preserve">Handwritten page</w:t>
             </w:r>
           </w:p>
         </w:tc>
@@ -700,7 +736,43 @@
               <w:rPr>
                 <w:sz w:val="16"/>
               </w:rPr>
-              <w:t xml:space="preserve">Every line of recipe content sits on a ruled line, including the second line of a step that wraps.</w:t>
+              <w:t xml:space="preserve">The Apple Pencil pages a recipe was written on (page mode), kept as one picture.</w:t>
+            </w:r>
+          </w:p>
+        </w:tc>
+      </w:tr>
+      <w:tr>
+        <w:tc>
+          <w:tcPr>
+            <w:tcW w:type="dxa" w:w="2592"/>
+            <w:vAlign w:val="center"/>
+          </w:tcPr>
+          <w:p>
+            <w:pPr>
+              <w:spacing w:after="20"/>
+            </w:pPr>
+            <w:r>
+              <w:rPr>
+                <w:sz w:val="16"/>
+              </w:rPr>
+              <w:t xml:space="preserve">Handwritten-only recipe</w:t>
+            </w:r>
+          </w:p>
+        </w:tc>
+        <w:tc>
+          <w:tcPr>
+            <w:tcW w:type="dxa" w:w="6624"/>
+            <w:vAlign w:val="center"/>
+          </w:tcPr>
+          <w:p>
+            <w:pPr>
+              <w:spacing w:after="20"/>
+            </w:pPr>
+            <w:r>
+              <w:rPr>
+                <w:sz w:val="16"/>
+              </w:rPr>
+              <w:t xml:space="preserve">A recipe with a handwritten page and no typed ingredients or steps. It can't be scaled, added to Groceries or cooked with Start Cooking until its lines are typed.</w:t>
             </w:r>
           </w:p>
         </w:tc>
@@ -736,7 +808,7 @@
               <w:rPr>
                 <w:sz w:val="16"/>
               </w:rPr>
-              <w:t xml:space="preserve">The scan, photo or PDF a recipe was transcribed from. Kept with the recipe and never changed.</w:t>
+              <w:t xml:space="preserve">The photo or PDF a recipe came from (Add from photos). Kept unchanged.</w:t>
             </w:r>
           </w:p>
         </w:tc>
@@ -755,7 +827,7 @@
               <w:rPr>
                 <w:sz w:val="16"/>
               </w:rPr>
-              <w:t xml:space="preserve">Handwritten page</w:t>
+              <w:t xml:space="preserve">Imported recipe</w:t>
             </w:r>
           </w:p>
         </w:tc>
@@ -772,7 +844,43 @@
               <w:rPr>
                 <w:sz w:val="16"/>
               </w:rPr>
-              <w:t xml:space="preserve">The Apple Pencil drawing a recipe was written on in the app. Kept with the recipe and viewable next to the typed page.</w:t>
+              <w:t xml:space="preserve">Brought in from a link or a photo; shows “Check this import” until edited and saved.</w:t>
+            </w:r>
+          </w:p>
+        </w:tc>
+      </w:tr>
+      <w:tr>
+        <w:tc>
+          <w:tcPr>
+            <w:tcW w:type="dxa" w:w="2592"/>
+            <w:vAlign w:val="center"/>
+          </w:tcPr>
+          <w:p>
+            <w:pPr>
+              <w:spacing w:after="20"/>
+            </w:pPr>
+            <w:r>
+              <w:rPr>
+                <w:sz w:val="16"/>
+              </w:rPr>
+              <w:t xml:space="preserve">Times cooked</w:t>
+            </w:r>
+          </w:p>
+        </w:tc>
+        <w:tc>
+          <w:tcPr>
+            <w:tcW w:type="dxa" w:w="6624"/>
+            <w:vAlign w:val="center"/>
+          </w:tcPr>
+          <w:p>
+            <w:pPr>
+              <w:spacing w:after="20"/>
+            </w:pPr>
+            <w:r>
+              <w:rPr>
+                <w:sz w:val="16"/>
+              </w:rPr>
+              <w:t xml:space="preserve">Goes up by one when Start Cooking reaches the end, or from Mark as cooked.</w:t>
             </w:r>
           </w:p>
         </w:tc>
@@ -808,115 +916,7 @@
               <w:rPr>
                 <w:sz w:val="16"/>
               </w:rPr>
-              <w:t xml:space="preserve">The private key that allows saving. Only the owner's iPad has it; everyone else can only read.</w:t>
-            </w:r>
-          </w:p>
-        </w:tc>
-      </w:tr>
-      <w:tr>
-        <w:tc>
-          <w:tcPr>
-            <w:tcW w:type="dxa" w:w="2592"/>
-            <w:vAlign w:val="center"/>
-          </w:tcPr>
-          <w:p>
-            <w:pPr>
-              <w:spacing w:after="20"/>
-            </w:pPr>
-            <w:r>
-              <w:rPr>
-                <w:sz w:val="16"/>
-              </w:rPr>
-              <w:t xml:space="preserve">Deleted recipe</w:t>
-            </w:r>
-          </w:p>
-        </w:tc>
-        <w:tc>
-          <w:tcPr>
-            <w:tcW w:type="dxa" w:w="6624"/>
-            <w:vAlign w:val="center"/>
-          </w:tcPr>
-          <w:p>
-            <w:pPr>
-              <w:spacing w:after="20"/>
-            </w:pPr>
-            <w:r>
-              <w:rPr>
-                <w:sz w:val="16"/>
-              </w:rPr>
-              <w:t xml:space="preserve">Hidden everywhere but kept in the database marked as deleted, so every device learns about the delete. Saving it again restores it.</w:t>
-            </w:r>
-          </w:p>
-        </w:tc>
-      </w:tr>
-      <w:tr>
-        <w:tc>
-          <w:tcPr>
-            <w:tcW w:type="dxa" w:w="2592"/>
-            <w:vAlign w:val="center"/>
-          </w:tcPr>
-          <w:p>
-            <w:pPr>
-              <w:spacing w:after="20"/>
-            </w:pPr>
-            <w:r>
-              <w:rPr>
-                <w:sz w:val="16"/>
-              </w:rPr>
-              <w:t xml:space="preserve">Imported recipe</w:t>
-            </w:r>
-          </w:p>
-        </w:tc>
-        <w:tc>
-          <w:tcPr>
-            <w:tcW w:type="dxa" w:w="6624"/>
-            <w:vAlign w:val="center"/>
-          </w:tcPr>
-          <w:p>
-            <w:pPr>
-              <w:spacing w:after="20"/>
-            </w:pPr>
-            <w:r>
-              <w:rPr>
-                <w:sz w:val="16"/>
-              </w:rPr>
-              <w:t xml:space="preserve">A recipe brought in from a link or a photo. It shows a “Check this import” note until it has been edited and saved once.</w:t>
-            </w:r>
-          </w:p>
-        </w:tc>
-      </w:tr>
-      <w:tr>
-        <w:tc>
-          <w:tcPr>
-            <w:tcW w:type="dxa" w:w="2592"/>
-            <w:vAlign w:val="center"/>
-          </w:tcPr>
-          <w:p>
-            <w:pPr>
-              <w:spacing w:after="20"/>
-            </w:pPr>
-            <w:r>
-              <w:rPr>
-                <w:sz w:val="16"/>
-              </w:rPr>
-              <w:t xml:space="preserve">Times cooked</w:t>
-            </w:r>
-          </w:p>
-        </w:tc>
-        <w:tc>
-          <w:tcPr>
-            <w:tcW w:type="dxa" w:w="6624"/>
-            <w:vAlign w:val="center"/>
-          </w:tcPr>
-          <w:p>
-            <w:pPr>
-              <w:spacing w:after="20"/>
-            </w:pPr>
-            <w:r>
-              <w:rPr>
-                <w:sz w:val="16"/>
-              </w:rPr>
-              <w:t xml:space="preserve">Goes up by one when Start Cooking reaches the last step, or from the recipe menu.</w:t>
+              <w:t xml:space="preserve">The private key that allows changes; kept per browser after Unlock editing.</w:t>
             </w:r>
           </w:p>
         </w:tc>
@@ -952,7 +952,7 @@
               <w:rPr>
                 <w:sz w:val="16"/>
               </w:rPr>
-              <w:t xml:space="preserve">White and cream backgrounds everywhere; there is no dark mode.</w:t>
+              <w:t xml:space="preserve">White and cream backgrounds everywhere; no dark mode.</w:t>
             </w:r>
           </w:p>
         </w:tc>
@@ -969,7 +969,7 @@
     </w:p>
     <w:p>
       <w:r>
-        <w:t xml:space="preserve">Handwriting becomes text only through features built into the iPad (Scribble, Live Text and Apple's on-device text recognition) or by typing. Neither the app nor the website sends recipe pages, drawings, photos, or PDFs to an outside transcription or AI service.</w:t>
+        <w:t xml:space="preserve">Handwriting becomes text only through features built into the iPad (Scribble on the lines, Live Text copied from a picture) or by typing. Nothing sends recipe pages, drawings, photos or PDFs to an outside transcription or AI service; the Pencil page mode keeps the writing as a picture and does not read it.</w:t>
       </w:r>
     </w:p>
     <w:p>
@@ -979,7 +979,7 @@
     </w:p>
     <w:p>
       <w:r>
-        <w:t xml:space="preserve">Verification status: Specified; to verify at each release</w:t>
+        <w:t xml:space="preserve">Verification status: Specified; checked in code review 2026-10-29</w:t>
       </w:r>
     </w:p>
     <w:p>
@@ -987,12 +987,12 @@
         <w:pStyle w:val="Heading1"/>
       </w:pPr>
       <w:r>
-        <w:t xml:space="preserve">4. Book page (writing page and handwritten view)</w:t>
+        <w:t xml:space="preserve">4. Home</w:t>
       </w:r>
     </w:p>
     <w:p>
       <w:r>
-        <w:t xml:space="preserve">The book page reproduces the spiral book page from the reference photo. Today it is the website's reading page (deployed). With the redesign it becomes the writing page (section 7) and the View handwritten page screen, and reading moves to the recipe view (FR-VIEW-001).</w:t>
+        <w:t xml:space="preserve">Home is the page opened before cooking or shopping (changed 2026-10-29; it was a book shelf). Browsing is the Library's job (Section 5). Home always loads fresh.</w:t>
       </w:r>
     </w:p>
     <w:p>
@@ -1000,22 +1000,22 @@
         <w:pStyle w:val="Heading2"/>
       </w:pPr>
       <w:r>
-        <w:t xml:space="preserve">FR-PAGE-001  Title row and stat box</w:t>
+        <w:t xml:space="preserve">FR-HOME-001  Pick up where you left off</w:t>
       </w:r>
     </w:p>
     <w:p>
       <w:r>
-        <w:t xml:space="preserve">The page opens with the gray serif “recipe:” label, the title in handwriting (wrapping onto a second line if needed), and a teal asterisk for favorites. A three-cell box shows Servings, Prep time and Cook time under a mauve header strip, with the values in handwriting (“4”, “45 min”, “15 min”). On wide screens the box sits at the top right; on phones it sits under the title.</w:t>
+        <w:t xml:space="preserve">If Start Cooking was left part way in the last day on this device, Home shows “Continue cooking”, the recipe and “step 2 of 4”; tapping it reopens Start Cooking at that step and serving size. Otherwise it shows the last recipe opened. Remembered per browser only.</w:t>
       </w:r>
     </w:p>
     <w:p>
       <w:r>
-        <w:t xml:space="preserve">Acceptance: The sweet chili chicken page shows the same title, asterisk and stat values as the reference photo.</w:t>
+        <w:t xml:space="preserve">Acceptance: Leave Start Cooking at step 2 at 1.5× servings; Home's link reopens step 2 at 1.5×.</w:t>
       </w:r>
     </w:p>
     <w:p>
       <w:r>
-        <w:t xml:space="preserve">Verification status: Deployed 2026-10-27 at https://ramiyas-recipes.vercel.app (commit f5b036c); compared with the reference photo in headless Chrome; owner verification pending</w:t>
+        <w:t xml:space="preserve">Verification status: Deployed at https://ramiyas-recipes.vercel.app (main at 19be9f4, 2026-10-29); checked in WebKit with an iPad profile and in headless Chrome; owner check on the iPad pending</w:t>
       </w:r>
     </w:p>
     <w:p>
@@ -1023,22 +1023,22 @@
         <w:pStyle w:val="Heading2"/>
       </w:pPr>
       <w:r>
-        <w:t xml:space="preserve">FR-PAGE-002  Tag checkboxes</w:t>
+        <w:t xml:space="preserve">FR-HOME-002  Surprise me</w:t>
       </w:r>
     </w:p>
     <w:p>
       <w:r>
-        <w:t xml:space="preserve">All sixteen tags from the book are shown in the book's order as small circle checkboxes: Quick &amp; Easy, Slow Cooker, One Pot/Pan, Kid Chef Friendly, Everyday, Make Ahead, Pressure Cooker, Air Fryer, Family Favorite, Special Occasion, Veg, Vegan, Gluten Free, Dairy Free, Nut Free, Kosher. A checked tag gets a hand-drawn ✗ and its name turns plum.</w:t>
+        <w:t xml:space="preserve">A Surprise me button opens a random recipe, not the last one opened.</w:t>
       </w:r>
     </w:p>
     <w:p>
       <w:r>
-        <w:t xml:space="preserve">Acceptance: Only Family Favorite is checked on the sweet chili chicken page; a screen reader announces it as checked.</w:t>
+        <w:t xml:space="preserve">Acceptance: Tapping it opens a recipe page.</w:t>
       </w:r>
     </w:p>
     <w:p>
       <w:r>
-        <w:t xml:space="preserve">Verification status: Deployed 2026-10-27 at https://ramiyas-recipes.vercel.app (commit f5b036c); compared with the reference photo in headless Chrome; owner verification pending</w:t>
+        <w:t xml:space="preserve">Verification status: Deployed at https://ramiyas-recipes.vercel.app (main at 19be9f4, 2026-10-29); checked in WebKit with an iPad profile and in headless Chrome; owner check on the iPad pending</w:t>
       </w:r>
     </w:p>
     <w:p>
@@ -1046,22 +1046,22 @@
         <w:pStyle w:val="Heading2"/>
       </w:pPr>
       <w:r>
-        <w:t xml:space="preserve">FR-PAGE-003  Ingredients in two balanced columns</w:t>
+        <w:t xml:space="preserve">FR-HOME-003  This week's meals</w:t>
       </w:r>
     </w:p>
     <w:p>
       <w:r>
-        <w:t xml:space="preserve">Ingredients are listed by group. On screens 768px and wider, whole groups fill the left column until it holds about half of the lines, and the rest go to the right column; a group is never split across columns. A group's name sits right-aligned on its own line above its items, and a blank line separates groups in the same column. Both columns are padded with empty ruled lines to the same height, plus one spare line. On phones the columns stack and the padding lines are dropped.</w:t>
+        <w:t xml:space="preserve">Today and the next 6 days as a strip of day cards (the device's own calendar days). Each day holds recipes, each with how many it should serve, or plain notes (“leftovers”). + Add (unlocked) searches recipes, sets servings with − and +, or writes a note; × removes. The plan is stored online, so every device shows the same week. Meals more than a month old are cleared out automatically.</w:t>
       </w:r>
     </w:p>
     <w:p>
       <w:r>
-        <w:t xml:space="preserve">Acceptance: Sweet chili chicken: marinade (7 items) on the left; coconut lime drizzle (6 items), a blank line, and “2 c cooked rice” on the right; both columns end on the same ruled line.</w:t>
+        <w:t xml:space="preserve">Acceptance: Adding a recipe for 6 to today and a note to tomorrow shows both on every device; removing one removes it everywhere.</w:t>
       </w:r>
     </w:p>
     <w:p>
       <w:r>
-        <w:t xml:space="preserve">Verification status: Deployed 2026-10-27 at https://ramiyas-recipes.vercel.app (commit f5b036c); compared with the reference photo in headless Chrome; owner verification pending</w:t>
+        <w:t xml:space="preserve">Verification status: Deployed at https://ramiyas-recipes.vercel.app (2026-10-29) and in use by the owner (migration 002 run 2026-10-29)</w:t>
       </w:r>
     </w:p>
     <w:p>
@@ -1069,22 +1069,22 @@
         <w:pStyle w:val="Heading2"/>
       </w:pPr>
       <w:r>
-        <w:t xml:space="preserve">FR-PAGE-004  Directions</w:t>
+        <w:t xml:space="preserve">FR-HOME-004  Add the week to Groceries</w:t>
       </w:r>
     </w:p>
     <w:p>
       <w:r>
-        <w:t xml:space="preserve">Directions are listed under DIRECTIONS on continuous ruled paper. Each step starts with ▷; its sub-steps are indented and start with “–”. Long lines wrap onto the next rule, with the wrapped text lined up under the text rather than under the dash.</w:t>
+        <w:t xml:space="preserve">One button opens the grocery sheet with every planned recipe's ingredients at its planned servings, one section per day and recipe, all ticked; untick what's at home, then add. Recipes without typed ingredients add nothing.</w:t>
       </w:r>
     </w:p>
     <w:p>
       <w:r>
-        <w:t xml:space="preserve">Acceptance: All four sweet chili chicken steps and their eight sub-steps appear in the photo's order, and every line of text sits on a rule.</w:t>
+        <w:t xml:space="preserve">Acceptance: Two planned recipes give a sheet with two sections; adding puts each line on the list linked to its recipe.</w:t>
       </w:r>
     </w:p>
     <w:p>
       <w:r>
-        <w:t xml:space="preserve">Verification status: Deployed 2026-10-27 at https://ramiyas-recipes.vercel.app (commit f5b036c); compared with the reference photo in headless Chrome; owner verification pending</w:t>
+        <w:t xml:space="preserve">Verification status: Deployed at https://ramiyas-recipes.vercel.app (2026-10-29) and in use by the owner</w:t>
       </w:r>
     </w:p>
     <w:p>
@@ -1092,22 +1092,22 @@
         <w:pStyle w:val="Heading2"/>
       </w:pPr>
       <w:r>
-        <w:t xml:space="preserve">FR-PAGE-005  Book decorations</w:t>
+        <w:t xml:space="preserve">FR-HOME-005  Groceries at a glance</w:t>
       </w:r>
     </w:p>
     <w:p>
       <w:r>
-        <w:t xml:space="preserve">On screens 768px and wider the page shows a spiral binding down the left edge and stickers in empty space: a rolling pin beside INGREDIENTS, a whisk and spoon beside DIRECTIONS, and a plate setting at the right. Decorations are hidden on phones, are skipped by screen readers, and are not printed.</w:t>
+        <w:t xml:space="preserve">How many items are left to buy, and the whole unchecked list in a box that scrolls inside the card, with Open the list.</w:t>
       </w:r>
     </w:p>
     <w:p>
       <w:r>
-        <w:t xml:space="preserve">Acceptance: Decorations never cover recipe text at any screen width.</w:t>
+        <w:t xml:space="preserve">Acceptance: With 28 items, the card shows “28 items left to buy” and scrolls to the last item.</w:t>
       </w:r>
     </w:p>
     <w:p>
       <w:r>
-        <w:t xml:space="preserve">Verification status: Deployed 2026-10-27 at https://ramiyas-recipes.vercel.app (commit f5b036c); compared with the reference photo in headless Chrome; owner verification pending</w:t>
+        <w:t xml:space="preserve">Verification status: Built 2026-10-29, not yet deployed; checked in WebKit with an iPad profile (and headless Chrome); owner check pending</w:t>
       </w:r>
     </w:p>
     <w:p>
@@ -1115,45 +1115,22 @@
         <w:pStyle w:val="Heading2"/>
       </w:pPr>
       <w:r>
-        <w:t xml:space="preserve">FR-PAGE-006  Light only</w:t>
+        <w:t xml:space="preserve">FR-HOME-006  To finish</w:t>
       </w:r>
     </w:p>
     <w:p>
       <w:r>
-        <w:t xml:space="preserve">Backgrounds are white and cream on every screen of the website and app. There is no dark mode: pages look the same whatever the device's dark mode setting.</w:t>
+        <w:t xml:space="preserve">Handwritten-only recipes listed with Type the lines (FR-WRITE-010).</w:t>
       </w:r>
     </w:p>
     <w:p>
       <w:r>
-        <w:t xml:space="preserve">Acceptance: With the device in dark mode, every screen still shows white and cream backgrounds and dark text.</w:t>
+        <w:t xml:space="preserve">Acceptance: A Pencil-only recipe appears with a link that opens its writing page on the lines.</w:t>
       </w:r>
     </w:p>
     <w:p>
       <w:r>
-        <w:t xml:space="preserve">Verification status: Decided 2026-10-27; the website still follows the device's dark mode until website step R1</w:t>
-      </w:r>
-    </w:p>
-    <w:p>
-      <w:pPr>
-        <w:pStyle w:val="Heading2"/>
-      </w:pPr>
-      <w:r>
-        <w:t xml:space="preserve">FR-PAGE-007  View original card and handwritten page</w:t>
-      </w:r>
-    </w:p>
-    <w:p>
-      <w:r>
-        <w:t xml:space="preserve">A recipe that came from a scan, photo or PDF has a View original card toggle; one written with the Apple Pencil has a View handwritten page toggle. Each shows the original beside, or in place of, the typed page, on both the website and the app.</w:t>
-      </w:r>
-    </w:p>
-    <w:p>
-      <w:r>
-        <w:t xml:space="preserve">Acceptance: Toggling shows the original and toggling again returns to the page without reloading.</w:t>
-      </w:r>
-    </w:p>
-    <w:p>
-      <w:r>
-        <w:t xml:space="preserve">Verification status: Planned (iPad app Phases 3–4; website polish); to verify</w:t>
+        <w:t xml:space="preserve">Verification status: Deployed at https://ramiyas-recipes.vercel.app (main at 19be9f4, 2026-10-29); checked in WebKit with an iPad profile and in headless Chrome; owner check on the iPad pending</w:t>
       </w:r>
     </w:p>
     <w:p>
@@ -1161,35 +1138,7 @@
         <w:pStyle w:val="Heading1"/>
       </w:pPr>
       <w:r>
-        <w:t xml:space="preserve">5. Home, library and recipe view</w:t>
-      </w:r>
-    </w:p>
-    <w:p>
-      <w:r>
-        <w:t xml:space="preserve">Screens follow docs/DESIGN.md: white and cream, Deglaze green (#1F4D3D) for buttons and the + button, Instrument Serif page titles, Figtree for the interface, and recipe content in handwriting (Patrick Hand) in plum ink. Phones and iPads in portrait get a bottom tab bar (Home, Library, Groceries, Settings); iPads in landscape and desktops get the same as a left sidebar.</w:t>
-      </w:r>
-    </w:p>
-    <w:p>
-      <w:pPr>
-        <w:pStyle w:val="Heading2"/>
-      </w:pPr>
-      <w:r>
-        <w:t xml:space="preserve">FR-HOME-001  Home: the book shelf</w:t>
-      </w:r>
-    </w:p>
-    <w:p>
-      <w:r>
-        <w:t xml:space="preserve">Home shows the book's categories as large colored tabs (Mains, Sides, Desserts, More Recipes), then rows of Family Favorites and Recently added recipes.</w:t>
-      </w:r>
-    </w:p>
-    <w:p>
-      <w:r>
-        <w:t xml:space="preserve">Acceptance: Selecting the Mains tab lists only main dishes; the sweet chili chicken appears under Family Favorites.</w:t>
-      </w:r>
-    </w:p>
-    <w:p>
-      <w:r>
-        <w:t xml:space="preserve">Verification status: Planned (website step R1; iPad app Phase 2); to verify</w:t>
+        <w:t xml:space="preserve">5. Library, book view and recipe view</w:t>
       </w:r>
     </w:p>
     <w:p>
@@ -1202,17 +1151,17 @@
     </w:p>
     <w:p>
       <w:r>
-        <w:t xml:space="preserve">Library (“My Recipes”) lists every recipe as a white rounded card with a photo thumbnail (the photo, else the handwritten page, else the original card, else a cream placeholder with the first letter), a source line with an icon (website name, “From a photo”, “Written by hand”, or the cookbook), the title in handwriting, “by Author” when known, and the times-cooked count. A search pill and a filter button (categories and tags) sit above the list. Two columns on iPad, three on desktop.</w:t>
+        <w:t xml:space="preserve">Library (“My Recipes”) lists every recipe as a white card: a thumbnail (photo, else the handwritten page, else the original card's photo, else a cream placeholder with the first letter), a source line with an icon, the title in handwriting, “by Author”, the times-cooked count, and a favorite star in the top right corner (tap to add to or take off Favorites, unlocked only; locked devices see the favorites' stars). Search finds titles, ingredients, steps and tags. Below the search, the four colored category tabs and ★ Favorites are filters; the filter button holds the tags. Two columns on iPad, three on desktop.</w:t>
       </w:r>
     </w:p>
     <w:p>
       <w:r>
-        <w:t xml:space="preserve">Acceptance: Searching “lime” leaves only recipes with lime; filtering by Family Favorite leaves only favorites.</w:t>
+        <w:t xml:space="preserve">Acceptance: Searching “lime” leaves only recipes with lime; ★ Favorites leaves only favorites; tapping a star does not open the recipe.</w:t>
       </w:r>
     </w:p>
     <w:p>
       <w:r>
-        <w:t xml:space="preserve">Verification status: Planned (website step R1 (search in R4); iPad app Phase 2); to verify</w:t>
+        <w:t xml:space="preserve">Verification status: Deployed at https://ramiyas-recipes.vercel.app (main at 19be9f4, 2026-10-29); checked in WebKit with an iPad profile and in headless Chrome; owner check on the iPad pending</w:t>
       </w:r>
     </w:p>
     <w:p>
@@ -1220,22 +1169,22 @@
         <w:pStyle w:val="Heading2"/>
       </w:pPr>
       <w:r>
-        <w:t xml:space="preserve">FR-LIB-002  Add a recipe</w:t>
+        <w:t xml:space="preserve">FR-LIB-002  List | Book</w:t>
       </w:r>
     </w:p>
     <w:p>
       <w:r>
-        <w:t xml:space="preserve">A floating green + button opens a sheet with three choices: Save a recipe from the web (FR-WEB-001), Add from recipe photos (FR-UP-001), and Enter your own recipe (the writing page, section 7). It only appears on unlocked devices.</w:t>
+        <w:t xml:space="preserve">A List | Book switch on the Library opens the book view: the whole book to flip through like the spiral book. The cover is the Home Screen icon's wooden spoon and whisk on cream ruled paper; then contents with page numbers; then recipes by category. Every page is the same size with whole ruled lines (18–30 per page); a long recipe continues on the next page (“(continued)”). An open two-page spread with the spiral down the middle in landscape; one page in portrait. Swipe, arrow keys or ‹ › turn pages; side tabs jump to a section; contents entries jump to a recipe; a recipe with only a handwritten page shows the page.</w:t>
       </w:r>
     </w:p>
     <w:p>
       <w:r>
-        <w:t xml:space="preserve">Acceptance: Each choice opens its screen; on a locked browser the + button is not shown.</w:t>
+        <w:t xml:space="preserve">Acceptance: In landscape the cover sits alone on the right; turning shows pages 1–2; Mains jumps to the first main.</w:t>
       </w:r>
     </w:p>
     <w:p>
       <w:r>
-        <w:t xml:space="preserve">Verification status: Planned (website step R2–R3; iPad app Phase 3–4); to verify</w:t>
+        <w:t xml:space="preserve">Verification status: Deployed at https://ramiyas-recipes.vercel.app (main at 19be9f4, 2026-10-29); checked in WebKit with an iPad profile and in headless Chrome; owner check on the iPad pending</w:t>
       </w:r>
     </w:p>
     <w:p>
@@ -1248,17 +1197,17 @@
     </w:p>
     <w:p>
       <w:r>
-        <w:t xml:space="preserve">The recipe view follows the video's layout in handwriting on cream: back, share and menu at the top; the photo in a rounded container (a carousel when there is also a handwritten page or original card); the title in large handwriting; “by Author” and “from Source” links; servings, prep and cook; tags; Ingredients with group names as small headings and items in handwriting; numbered Directions with “–” sub-steps; Notes. “Add to Groceries” (outlined) and “Start Cooking” (filled green) stay at the bottom. On wide screens ingredients and directions sit side by side. The menu offers Edit, View handwritten page or View original card, and Delete.</w:t>
+        <w:t xml:space="preserve">Back, share and menu at the top; the cover photo shown whole at its own shape (never cropped); the title in large handwriting; “by” and “from” links; “in Mains” (opens the Library filtered); servings (the scaler), prep and cook; tags; ingredients by group; numbered directions with “–” sub-steps; notes. Add to Groceries and Start Cooking stay at the bottom. The menu: Open in the book, View handwritten page, View the original, and (unlocked) Edit recipe and Mark as cooked. A handwritten-only recipe shows its handwritten page in place of the ingredients and directions, and Type the lines in place of the bottom buttons.</w:t>
       </w:r>
     </w:p>
     <w:p>
       <w:r>
-        <w:t xml:space="preserve">Acceptance: The sweet chili chicken shows all 14 ingredients in their 3 groups and all 4 steps with their sub-steps, in handwriting, with both buttons visible while scrolling.</w:t>
+        <w:t xml:space="preserve">Acceptance: The sweet chili chicken shows 14 ingredients in 3 groups and 4 steps; a tall photo is not cut off.</w:t>
       </w:r>
     </w:p>
     <w:p>
       <w:r>
-        <w:t xml:space="preserve">Verification status: Planned (website step R1; iPad app Phase 2); to verify</w:t>
+        <w:t xml:space="preserve">Verification status: Deployed at https://ramiyas-recipes.vercel.app (main at 19be9f4, 2026-10-29); checked in WebKit with an iPad profile and in headless Chrome; owner check on the iPad pending</w:t>
       </w:r>
     </w:p>
     <w:p>
@@ -1271,17 +1220,17 @@
     </w:p>
     <w:p>
       <w:r>
-        <w:t xml:space="preserve">Recipes imported from a link or a photo show a muted “Check this import” note under the title until they are edited and saved once.</w:t>
+        <w:t xml:space="preserve">Recipes imported from a link or a photo show a muted note until edited and saved once.</w:t>
       </w:r>
     </w:p>
     <w:p>
       <w:r>
-        <w:t xml:space="preserve">Acceptance: An imported recipe shows the note; after one edit and save it no longer does.</w:t>
+        <w:t xml:space="preserve">Acceptance: An imported recipe shows the note; after one save it no longer does.</w:t>
       </w:r>
     </w:p>
     <w:p>
       <w:r>
-        <w:t xml:space="preserve">Verification status: Planned (website step R3; iPad app Phase 4); to verify</w:t>
+        <w:t xml:space="preserve">Verification status: Deployed 2026-10-28</w:t>
       </w:r>
     </w:p>
     <w:p>
@@ -1289,135 +1238,12 @@
         <w:pStyle w:val="Heading1"/>
       </w:pPr>
       <w:r>
-        <w:t xml:space="preserve">6. iPad app</w:t>
-      </w:r>
-    </w:p>
-    <w:p>
-      <w:pPr>
-        <w:pStyle w:val="Heading2"/>
-      </w:pPr>
-      <w:r>
-        <w:t xml:space="preserve">FR-APP-001  Install once, refresh automatically</w:t>
+        <w:t xml:space="preserve">6. Adding a recipe: the writing page</w:t>
       </w:r>
     </w:p>
     <w:p>
       <w:r>
-        <w:t xml:space="preserve">The app is installed on the owner's iPad with SideStore using a free Apple ID; there is no App Store listing and no paid developer account. Apps installed this way stop opening after 7 days unless refreshed, so a daily Shortcuts automation (and a second one when the iPad starts charging) refreshes it on the iPad. After the one-time setup with the Mac, the iPad never needs to be plugged in.</w:t>
-      </w:r>
-    </w:p>
-    <w:p>
-      <w:r>
-        <w:t xml:space="preserve">Acceptance: The app still opens 10 or more days after installation without a cable, and SideStore shows the expiry date moving forward each day.</w:t>
-      </w:r>
-    </w:p>
-    <w:p>
-      <w:r>
-        <w:t xml:space="preserve">Verification status: Planned (iPad app Phase 0); to verify</w:t>
-      </w:r>
-    </w:p>
-    <w:p>
-      <w:pPr>
-        <w:pStyle w:val="Heading2"/>
-      </w:pPr>
-      <w:r>
-        <w:t xml:space="preserve">FR-APP-002  A full recipe book</w:t>
-      </w:r>
-    </w:p>
-    <w:p>
-      <w:r>
-        <w:t xml:space="preserve">The app is the whole recipe book, not only a writing tool: the cover with category tabs, the recipe grid, recipe pages matching the book (section 4), writing, scanning, search, cook mode and the serving scaler. It works in portrait and landscape, and in Split View and Slide Over.</w:t>
-      </w:r>
-    </w:p>
-    <w:p>
-      <w:r>
-        <w:t xml:space="preserve">Acceptance: Every recipe on the website can be opened in the app and looks the same.</w:t>
-      </w:r>
-    </w:p>
-    <w:p>
-      <w:r>
-        <w:t xml:space="preserve">Verification status: Planned (iPad app Phase 2); to verify</w:t>
-      </w:r>
-    </w:p>
-    <w:p>
-      <w:pPr>
-        <w:pStyle w:val="Heading2"/>
-      </w:pPr>
-      <w:r>
-        <w:t xml:space="preserve">FR-APP-003  Works offline</w:t>
-      </w:r>
-    </w:p>
-    <w:p>
-      <w:r>
-        <w:t xml:space="preserve">All recipes are stored on the iPad and sync with the shared database whenever there is a connection. Recipes written or edited offline are saved on the iPad and sent when the connection returns. If the app stops opening because a refresh was missed, nothing is lost; the website still shows every recipe.</w:t>
-      </w:r>
-    </w:p>
-    <w:p>
-      <w:r>
-        <w:t xml:space="preserve">Acceptance: In airplane mode, every recipe opens and a new recipe can be written; it appears on the website after the iPad reconnects.</w:t>
-      </w:r>
-    </w:p>
-    <w:p>
-      <w:r>
-        <w:t xml:space="preserve">Verification status: Planned (iPad app Phase 2); to verify</w:t>
-      </w:r>
-    </w:p>
-    <w:p>
-      <w:pPr>
-        <w:pStyle w:val="Heading2"/>
-      </w:pPr>
-      <w:r>
-        <w:t xml:space="preserve">FR-APP-004  Write key and sync status</w:t>
-      </w:r>
-    </w:p>
-    <w:p>
-      <w:r>
-        <w:t xml:space="preserve">A Settings screen lets the owner enter the write key once (stored in the iPad's secure storage, never shown again in full) and shows when the app last synced and when it was last refreshed.</w:t>
-      </w:r>
-    </w:p>
-    <w:p>
-      <w:r>
-        <w:t xml:space="preserve">Acceptance: With a wrong write key, saving shows a clear message and keeps the recipe on the iPad for a later retry.</w:t>
-      </w:r>
-    </w:p>
-    <w:p>
-      <w:r>
-        <w:t xml:space="preserve">Verification status: Planned (iPad app Phase 2); to verify</w:t>
-      </w:r>
-    </w:p>
-    <w:p>
-      <w:pPr>
-        <w:pStyle w:val="Heading2"/>
-      </w:pPr>
-      <w:r>
-        <w:t xml:space="preserve">FR-APP-005  Updates without a computer</w:t>
-      </w:r>
-    </w:p>
-    <w:p>
-      <w:r>
-        <w:t xml:space="preserve">New app versions are built automatically when the owner publishes a release on GitHub, and SideStore offers the update on the iPad, to install with one tap.</w:t>
-      </w:r>
-    </w:p>
-    <w:p>
-      <w:r>
-        <w:t xml:space="preserve">Acceptance: After a new release, SideStore shows the update and installing it keeps all recipes.</w:t>
-      </w:r>
-    </w:p>
-    <w:p>
-      <w:r>
-        <w:t xml:space="preserve">Verification status: Planned (iPad app Phase 6); to verify</w:t>
-      </w:r>
-    </w:p>
-    <w:p>
-      <w:pPr>
-        <w:pStyle w:val="Heading1"/>
-      </w:pPr>
-      <w:r>
-        <w:t xml:space="preserve">7. Adding a recipe: the writing page (website and iPad app)</w:t>
-      </w:r>
-    </w:p>
-    <w:p>
-      <w:r>
-        <w:t xml:space="preserve">“Enter your own recipe” and Edit open the writing page: a blank book page like the sweet chili chicken photo (section 4), with Cancel and Save at the bottom and a button to add the recipe's photo. On the website and in the app, the cook writes on the ruled lines with Scribble (it works in Safari on iPad too) or types. The app adds page mode: writing anywhere with the Apple Pencil.</w:t>
+        <w:t xml:space="preserve">Enter your own recipe and Edit open the writing page: the book page as a form, with Cancel and Save at the bottom. A switch at the top chooses Write on the lines or Write on the page.</w:t>
       </w:r>
     </w:p>
     <w:p>
@@ -1430,17 +1256,17 @@
     </w:p>
     <w:p>
       <w:r>
-        <w:t xml:space="preserve">Each ruled line is its own text field, at least 48pt tall and the full width of the line, shown in the handwriting font and plum ink so recognized text looks like it belongs on the page.</w:t>
+        <w:t xml:space="preserve">Each ruled line is its own field in the handwriting font and plum ink, so Scribble fills one line at a time. There is always an empty next line; Return moves to it (and keeps the iPad keyboard up).</w:t>
       </w:r>
     </w:p>
     <w:p>
       <w:r>
-        <w:t xml:space="preserve">Acceptance: Writing with Scribble directly over any line fills that line and no other.</w:t>
+        <w:t xml:space="preserve">Acceptance: Writing over a line with Scribble fills that line only; Return moves to the next.</w:t>
       </w:r>
     </w:p>
     <w:p>
       <w:r>
-        <w:t xml:space="preserve">Verification status: Planned (website step R2; iPad app Phase 3); to verify</w:t>
+        <w:t xml:space="preserve">Verification status: Deployed 2026-10-28; keyboard fix built 2026-10-29, not yet deployed; checked in webkit with an ipad profile (and headless chrome); owner check pending</w:t>
       </w:r>
     </w:p>
     <w:p>
@@ -1448,22 +1274,22 @@
         <w:pStyle w:val="Heading2"/>
       </w:pPr>
       <w:r>
-        <w:t xml:space="preserve">FR-WRITE-002  Always a next line</w:t>
+        <w:t xml:space="preserve">FR-WRITE-002  Page layout</w:t>
       </w:r>
     </w:p>
     <w:p>
       <w:r>
-        <w:t xml:space="preserve">When a line gets text, a new empty line appears below it, so there is always somewhere to write next.</w:t>
+        <w:t xml:space="preserve">Add a photo at the top right; the “recipe:” title line and the mauve stat box (they share a row when there's room, else stack); the tag circles; the colored category tabs on the page's right edge; INGREDIENTS in sections with names; DIRECTIONS with ▷ and – (start a line with “-”, or tap ▷); notes; and By, From and Description under More details.</w:t>
       </w:r>
     </w:p>
     <w:p>
       <w:r>
-        <w:t xml:space="preserve">Acceptance: After filling the last empty ingredient or direction line, a new empty line is present.</w:t>
+        <w:t xml:space="preserve">Acceptance: Beside a photo or handwritten page the title is still a full line, and nothing scrolls sideways.</w:t>
       </w:r>
     </w:p>
     <w:p>
       <w:r>
-        <w:t xml:space="preserve">Verification status: Planned (website step R2; iPad app Phase 3); to verify</w:t>
+        <w:t xml:space="preserve">Verification status: Deployed at https://ramiyas-recipes.vercel.app (main at 19be9f4, 2026-10-29); checked in WebKit with an iPad profile and in headless Chrome; owner check on the iPad pending</w:t>
       </w:r>
     </w:p>
     <w:p>
@@ -1476,17 +1302,17 @@
     </w:p>
     <w:p>
       <w:r>
-        <w:t xml:space="preserve">When the cook finishes an ingredient line, a rule-based parser splits it into amount, unit and item. It understands whole numbers, fractions, mixed numbers and ½-style characters, and common units: c, cup, TB, tbsp, tsp, lb, lbs, oz, g, clove, pinch. The line still shows exactly as written.</w:t>
+        <w:t xml:space="preserve">A rule-based parser splits each line into amount, unit and item. It understands whole numbers, fractions, mixed numbers (“1 1/2”, “1 ½”), ½-style characters, ranges, and common units. The line still shows exactly as written.</w:t>
       </w:r>
     </w:p>
     <w:p>
       <w:r>
-        <w:t xml:space="preserve">Acceptance: “1/3 c sweet chili sauce” becomes 1/3 | c | sweet chili sauce; “pinch of salt” keeps the whole line as the item with no amount.</w:t>
+        <w:t xml:space="preserve">Acceptance: “1/3 c sweet chili sauce” becomes 1/3 | c | sweet chili sauce; “pinch of salt” has no amount.</w:t>
       </w:r>
     </w:p>
     <w:p>
       <w:r>
-        <w:t xml:space="preserve">Verification status: Planned (website step R2; iPad app Phase 3); to verify</w:t>
+        <w:t xml:space="preserve">Verification status: Deployed 2026-10-28; tests against shared/fixtures/ingredient-lines.json</w:t>
       </w:r>
     </w:p>
     <w:p>
@@ -1494,22 +1320,22 @@
         <w:pStyle w:val="Heading2"/>
       </w:pPr>
       <w:r>
-        <w:t xml:space="preserve">FR-WRITE-004  Groups, steps and sub-steps</w:t>
+        <w:t xml:space="preserve">FR-WRITE-004  Stat box, tags and category</w:t>
       </w:r>
     </w:p>
     <w:p>
       <w:r>
-        <w:t xml:space="preserve">A “+ add a section” line starts a new named ingredient group. In directions, a new line is a ▷ step; an indent button, or starting the line with “-”, makes it a sub-step of the step above.</w:t>
+        <w:t xml:space="preserve">Servings, prep and cook are number fields (Scribble works); non-numbers are refused with a message. Tags toggle by tapping their circles; the category by tapping its tab.</w:t>
       </w:r>
     </w:p>
     <w:p>
       <w:r>
-        <w:t xml:space="preserve">Acceptance: Entering the sweet chili chicken recipe produces the same groups, steps and sub-steps as FR-PAGE-003 and FR-PAGE-004.</w:t>
+        <w:t xml:space="preserve">Acceptance: “about 20” in Cook time is refused with “Cook time should be a number”.</w:t>
       </w:r>
     </w:p>
     <w:p>
       <w:r>
-        <w:t xml:space="preserve">Verification status: Planned (website step R2; iPad app Phase 3); to verify</w:t>
+        <w:t xml:space="preserve">Verification status: Deployed 2026-10-28</w:t>
       </w:r>
     </w:p>
     <w:p>
@@ -1517,22 +1343,22 @@
         <w:pStyle w:val="Heading2"/>
       </w:pPr>
       <w:r>
-        <w:t xml:space="preserve">FR-WRITE-005  Stat box and tags</w:t>
+        <w:t xml:space="preserve">FR-WRITE-005  Drafts are never lost</w:t>
       </w:r>
     </w:p>
     <w:p>
       <w:r>
-        <w:t xml:space="preserve">Servings, prep and cook minutes are number fields that open the number keypad; Scribble also works on them. Tags are toggled by tapping their checkboxes.</w:t>
+        <w:t xml:space="preserve">The draft (and any Pencil writing) is kept in the browser after every change and restored with “Restored your unsaved draft” and Discard it.</w:t>
       </w:r>
     </w:p>
     <w:p>
       <w:r>
-        <w:t xml:space="preserve">Acceptance: Non-numeric input in a stat field is refused with a visible message.</w:t>
+        <w:t xml:space="preserve">Acceptance: Reloading mid-recipe restores every line and the Pencil pages.</w:t>
       </w:r>
     </w:p>
     <w:p>
       <w:r>
-        <w:t xml:space="preserve">Verification status: Planned (website step R2; iPad app Phase 3); to verify</w:t>
+        <w:t xml:space="preserve">Verification status: Deployed 2026-10-28 (Pencil writing 2026-10-29)</w:t>
       </w:r>
     </w:p>
     <w:p>
@@ -1540,22 +1366,22 @@
         <w:pStyle w:val="Heading2"/>
       </w:pPr>
       <w:r>
-        <w:t xml:space="preserve">FR-WRITE-006  Drafts are never lost</w:t>
+        <w:t xml:space="preserve">FR-WRITE-006  Write on the page (Apple Pencil)</w:t>
       </w:r>
     </w:p>
     <w:p>
       <w:r>
-        <w:t xml:space="preserve">The draft is saved on the device after every change.</w:t>
+        <w:t xml:space="preserve">Ruled pages to write on anywhere with the Apple Pencil: pressure-sensitive plum pen, eraser, Undo, Clear, and Draw with finger. Fingers scroll; only the Pencil draws. “+ Add a page” adds pages; an empty last page can be removed. The title, stats, tags, category and photo stay as fields above. On Save the pages become one picture, the handwritten page; it is not read into text (FR-RULE-001). Editing draws new ink over the saved page.</w:t>
       </w:r>
     </w:p>
     <w:p>
       <w:r>
-        <w:t xml:space="preserve">Acceptance: Reloading the website or force-quitting the app mid-recipe restores every line entered so far.</w:t>
+        <w:t xml:space="preserve">Acceptance: Writing two pages and saving gives one handwritten page with both; holding the Pencil still brings up no text selection or loupe.</w:t>
       </w:r>
     </w:p>
     <w:p>
       <w:r>
-        <w:t xml:space="preserve">Verification status: Planned (website step R2; iPad app Phase 3); to verify</w:t>
+        <w:t xml:space="preserve">Verification status: Deployed at https://ramiyas-recipes.vercel.app (main at 19be9f4, 2026-10-29); checked in WebKit with an iPad profile and in headless Chrome; owner check on the iPad pending; Pencil feel to be checked by the owner</w:t>
       </w:r>
     </w:p>
     <w:p>
@@ -1563,22 +1389,22 @@
         <w:pStyle w:val="Heading2"/>
       </w:pPr>
       <w:r>
-        <w:t xml:space="preserve">FR-WRITE-007  Scribble tips</w:t>
+        <w:t xml:space="preserve">FR-WRITE-007  Favorites, groceries and cooking need lines</w:t>
       </w:r>
     </w:p>
     <w:p>
       <w:r>
-        <w:t xml:space="preserve">A one-time hint card explains how to turn on Scribble (Settings → Apple Pencil → Scribble), scratch out to delete, circle to select, and tap with a finger to type instead.</w:t>
+        <w:t xml:space="preserve">Groceries, Start Cooking, the scaler and ingredient search use the typed lines. A handwritten-only recipe says so and offers Type the lines.</w:t>
       </w:r>
     </w:p>
     <w:p>
       <w:r>
-        <w:t xml:space="preserve">Acceptance: The hint card appears on first use only and can be reopened.</w:t>
+        <w:t xml:space="preserve">Acceptance: A handwritten-only recipe has no Start Cooking button and shows Type the lines.</w:t>
       </w:r>
     </w:p>
     <w:p>
       <w:r>
-        <w:t xml:space="preserve">Verification status: Planned (website step R2; iPad app Phase 3); to verify</w:t>
+        <w:t xml:space="preserve">Verification status: Deployed at https://ramiyas-recipes.vercel.app (main at 19be9f4, 2026-10-29); checked in WebKit with an iPad profile and in headless Chrome; owner check on the iPad pending</w:t>
       </w:r>
     </w:p>
     <w:p>
@@ -1586,22 +1412,22 @@
         <w:pStyle w:val="Heading2"/>
       </w:pPr>
       <w:r>
-        <w:t xml:space="preserve">FR-WRITE-008  Write anywhere on the page</w:t>
+        <w:t xml:space="preserve">FR-WRITE-010  Type the lines beside the handwritten page</w:t>
       </w:r>
     </w:p>
     <w:p>
       <w:r>
-        <w:t xml:space="preserve">In page mode the cook writes freely with the Apple Pencil, like writing in the book. The drawing is kept as the recipe's handwritten page, and on-device text recognition turns it into text for the cook to check line by line before saving.</w:t>
+        <w:t xml:space="preserve">Type the lines (recipe view or Home's To finish) opens the writing page on the lines with the handwritten page beside it (above it in portrait), and a Paste text box for text copied from the page with Live Text.</w:t>
       </w:r>
     </w:p>
     <w:p>
       <w:r>
-        <w:t xml:space="preserve">Acceptance: Writing the sweet chili chicken recipe in page mode gives the same groups and steps after review, and the handwritten page opens from the recipe.</w:t>
+        <w:t xml:space="preserve">Acceptance: /recipe/&lt;slug&gt;/edit?lines=1 opens the lines, with the handwritten page beside them.</w:t>
       </w:r>
     </w:p>
     <w:p>
       <w:r>
-        <w:t xml:space="preserve">Verification status: Planned (iPad app Phase 3); to verify</w:t>
+        <w:t xml:space="preserve">Verification status: Deployed at https://ramiyas-recipes.vercel.app (main at 19be9f4, 2026-10-29); checked in WebKit with an iPad profile and in headless Chrome; owner check on the iPad pending</w:t>
       </w:r>
     </w:p>
     <w:p>
@@ -1609,7 +1435,7 @@
         <w:pStyle w:val="Heading1"/>
       </w:pPr>
       <w:r>
-        <w:t xml:space="preserve">8. Adding a recipe: from the web and from photos</w:t>
+        <w:t xml:space="preserve">7. Adding a recipe: from the web, from photos, by pasting</w:t>
       </w:r>
     </w:p>
     <w:p>
@@ -1622,17 +1448,17 @@
     </w:p>
     <w:p>
       <w:r>
-        <w:t xml:space="preserve">The cook pastes a link to a recipe page. The site reads the recipe data that recipe websites publish for search engines (schema.org): title, photo, author, site name, servings, times, ingredients and steps. No AI is involved. The result opens in the writing page for review; nothing is saved until the cook saves. If the page publishes no recipe data, the writing page opens with the link and page title filled in. The app uses the same importer as the website.</w:t>
+        <w:t xml:space="preserve">Paste a link; the site reads the recipe data the page publishes for search engines (schema.org): title, photo, author, site, servings, times, ingredients and steps. No AI. The result opens in the writing page for review. Pages with no recipe data, or sites that refuse to be read, open with the link and a Paste text box. Only public web addresses work; the photo is copied in on save.</w:t>
       </w:r>
     </w:p>
     <w:p>
       <w:r>
-        <w:t xml:space="preserve">Acceptance: A link to a recipe on a major recipe site fills the title, ingredients and steps; a link to a page without recipe data opens the writing page with only the link and title.</w:t>
+        <w:t xml:space="preserve">Acceptance: A BBC Good Food link fills 16 ingredients and 11 steps; an Allrecipes link (refused) offers Paste text.</w:t>
       </w:r>
     </w:p>
     <w:p>
       <w:r>
-        <w:t xml:space="preserve">Verification status: Planned (website step R3; iPad app Phase 4); to verify</w:t>
+        <w:t xml:space="preserve">Verification status: Deployed 2026-10-28</w:t>
       </w:r>
     </w:p>
     <w:p>
@@ -1640,22 +1466,22 @@
         <w:pStyle w:val="Heading2"/>
       </w:pPr>
       <w:r>
-        <w:t xml:space="preserve">FR-UP-001  Scan a page or import a file</w:t>
+        <w:t xml:space="preserve">FR-UP-001  Add from photos</w:t>
       </w:r>
     </w:p>
     <w:p>
       <w:r>
-        <w:t xml:space="preserve">The cook can scan a page with the iPad's document scanner (which finds the page edges and flattens it), or import a photo or a PDF, for example a GoodNotes or Notability export, an Apple Notes page, or a card from the spiral book. The file is kept as the recipe's original card.</w:t>
+        <w:t xml:space="preserve">Upload a photo or PDF (up to 20 MB). It shows beside the writing page (above it on narrow screens) with a Paste text box for iPad Live Text (touch and hold, Select All, Copy). The file is kept as the original card.</w:t>
       </w:r>
     </w:p>
     <w:p>
       <w:r>
-        <w:t xml:space="preserve">Acceptance: After saving, the original card opens from the recipe on the iPad and on the website (FR-PAGE-007). On the website, upload works from any browser; scanning with the document scanner is app only.</w:t>
+        <w:t xml:space="preserve">Acceptance: After saving, View the original opens the file; the Library thumbnail shows the photo.</w:t>
       </w:r>
     </w:p>
     <w:p>
       <w:r>
-        <w:t xml:space="preserve">Verification status: Planned (website step R3; iPad app Phase 4); to verify</w:t>
+        <w:t xml:space="preserve">Verification status: Deployed 2026-10-28</w:t>
       </w:r>
     </w:p>
     <w:p>
@@ -1663,76 +1489,22 @@
         <w:pStyle w:val="Heading2"/>
       </w:pPr>
       <w:r>
-        <w:t xml:space="preserve">FR-UP-002  Original beside the writing page</w:t>
+        <w:t xml:space="preserve">FR-PASTE-001  Turn pasted text into a recipe</w:t>
       </w:r>
     </w:p>
     <w:p>
       <w:r>
-        <w:t xml:space="preserve">The scan or file shows on one side, with pinch-to-zoom and page arrows, and the write page on the other, so the cook can check or copy it line by line.</w:t>
+        <w:t xml:space="preserve">Rules sort pasted text into the page. Headings (Ingredients, Directions, Notes) start sections; the book page's stat box and tag lines are read or skipped; ▷, numbers or “Step 1” start a step and “-” a sub-step; section names are found (“marinade”, “For the sauce:”). Without headings, amounts are ingredients and the steps start after them: a line without an amount stays an ingredient when another amount follows within two lines or it reads like one (“salt and pepper to taste”), and a line that starts like a step (“cream butter &amp; sugar”, “in a bowl…”) starts the steps. Handwriting misreads are tidied: stray capitals (“sugaR”, “BRead”), “0z”/“20z” for oz, “6q” for 6g, a lone “?” for “&amp;”, and in a recipe measured in grams a unitless “1709” or “3400” is read as 170 g or 340 g. Lines Live Text ran together are split before a clear cooking verb, and a word cut across two lines is joined back.</w:t>
       </w:r>
     </w:p>
     <w:p>
       <w:r>
-        <w:t xml:space="preserve">Acceptance: On an iPad in landscape both halves are usable without scrolling sideways.</w:t>
+        <w:t xml:space="preserve">Acceptance: The owner's Live Text copy of the salted maple banana bread card gives 10 ingredients (170 g, 6 g and 2 oz restored) and 5 steps; misread words, and the one line Live Text dropped, are left for review.</w:t>
       </w:r>
     </w:p>
     <w:p>
       <w:r>
-        <w:t xml:space="preserve">Verification status: Planned (website step R3; iPad app Phase 4); to verify</w:t>
-      </w:r>
-    </w:p>
-    <w:p>
-      <w:pPr>
-        <w:pStyle w:val="Heading2"/>
-      </w:pPr>
-      <w:r>
-        <w:t xml:space="preserve">FR-UP-003  Text from the scan</w:t>
-      </w:r>
-    </w:p>
-    <w:p>
-      <w:r>
-        <w:t xml:space="preserve">In the app, on-device text recognition reads the scan, photo or PDF (or uses a PDF's existing text, as GoodNotes and Notability exports can have), and the paste rules (section 9) turn it into a recipe for review. On the website, a Paste text box next to the original takes text copied with iPad Live Text.</w:t>
-      </w:r>
-    </w:p>
-    <w:p>
-      <w:r>
-        <w:t xml:space="preserve">Acceptance: Recognized text always opens for review and is never saved directly.</w:t>
-      </w:r>
-    </w:p>
-    <w:p>
-      <w:r>
-        <w:t xml:space="preserve">Verification status: Planned (website step R3; iPad app Phase 4); to verify</w:t>
-      </w:r>
-    </w:p>
-    <w:p>
-      <w:pPr>
-        <w:pStyle w:val="Heading1"/>
-      </w:pPr>
-      <w:r>
-        <w:t xml:space="preserve">9. Adding a recipe: paste a recipe</w:t>
-      </w:r>
-    </w:p>
-    <w:p>
-      <w:pPr>
-        <w:pStyle w:val="Heading2"/>
-      </w:pPr>
-      <w:r>
-        <w:t xml:space="preserve">FR-PASTE-001  Turn text into a recipe</w:t>
-      </w:r>
-    </w:p>
-    <w:p>
-      <w:r>
-        <w:t xml:space="preserve">Text from a scan, from the handwritten page, or pasted from iPad Live Text (press and hold, Select All, Copy) is split with simple rules: the first line is the title; lines after “ingredients” are ingredients and lines after “directions”, “instructions” or “method” are steps; lines starting with an amount are ingredients; lines starting with ▷, &gt;, a number or a bullet start a step; lines starting with “-” are sub-steps; short lines with no amount in the ingredient area are group names; anything unclear goes into Notes.</w:t>
-      </w:r>
-    </w:p>
-    <w:p>
-      <w:r>
-        <w:t xml:space="preserve">Acceptance: The text of the reference photo gives the title, 2 ingredient groups (marinade with 7 items, drizzle with 6), and 4 direction groups with their sub-steps.</w:t>
-      </w:r>
-    </w:p>
-    <w:p>
-      <w:r>
-        <w:t xml:space="preserve">Verification status: Planned (website step R3; iPad app Phase 4); to verify</w:t>
+        <w:t xml:space="preserve">Verification status: Built 2026-10-29, not yet deployed; checked in WebKit with an iPad profile (and headless Chrome); owner check pending; tests against shared/fixtures/pasted-recipes.json (5 cases)</w:t>
       </w:r>
     </w:p>
     <w:p>
@@ -1745,17 +1517,17 @@
     </w:p>
     <w:p>
       <w:r>
-        <w:t xml:space="preserve">The parsed result always opens in the write page for review, next to the original if there is one. Nothing is saved until the cook saves it.</w:t>
+        <w:t xml:space="preserve">Filled pages always open for review; nothing is saved until Save. Words the recognition misread are not guessed at.</w:t>
       </w:r>
     </w:p>
     <w:p>
       <w:r>
-        <w:t xml:space="preserve">Acceptance: Leaving the review without saving creates no recipe.</w:t>
+        <w:t xml:space="preserve">Acceptance: Leaving without saving creates no recipe.</w:t>
       </w:r>
     </w:p>
     <w:p>
       <w:r>
-        <w:t xml:space="preserve">Verification status: Planned (website step R3; iPad app Phase 4); to verify</w:t>
+        <w:t xml:space="preserve">Verification status: Deployed 2026-10-28</w:t>
       </w:r>
     </w:p>
     <w:p>
@@ -1763,61 +1535,7 @@
         <w:pStyle w:val="Heading1"/>
       </w:pPr>
       <w:r>
-        <w:t xml:space="preserve">10. Browsing and search</w:t>
-      </w:r>
-    </w:p>
-    <w:p>
-      <w:pPr>
-        <w:pStyle w:val="Heading2"/>
-      </w:pPr>
-      <w:r>
-        <w:t xml:space="preserve">FR-SRCH-001  Search</w:t>
-      </w:r>
-    </w:p>
-    <w:p>
-      <w:r>
-        <w:t xml:space="preserve">Search finds recipes by title, ingredient or tag, on the website and in the app (the app searches its offline copy).</w:t>
-      </w:r>
-    </w:p>
-    <w:p>
-      <w:r>
-        <w:t xml:space="preserve">Acceptance: Searching “lime” finds sweet chili chicken; searching a word in no recipe shows “no recipes here yet”.</w:t>
-      </w:r>
-    </w:p>
-    <w:p>
-      <w:r>
-        <w:t xml:space="preserve">Verification status: Planned (website step R4; iPad app Phase 5); the database search index exists since 2026-10-24</w:t>
-      </w:r>
-    </w:p>
-    <w:p>
-      <w:pPr>
-        <w:pStyle w:val="Heading2"/>
-      </w:pPr>
-      <w:r>
-        <w:t xml:space="preserve">FR-SRCH-002  Tag filters</w:t>
-      </w:r>
-    </w:p>
-    <w:p>
-      <w:r>
-        <w:t xml:space="preserve">The tag checkbox row doubles as a filter on the cover and category pages: checking tags shows only recipes that have all checked tags.</w:t>
-      </w:r>
-    </w:p>
-    <w:p>
-      <w:r>
-        <w:t xml:space="preserve">Acceptance: Checking Family Favorite and Vegan shows only recipes with both tags.</w:t>
-      </w:r>
-    </w:p>
-    <w:p>
-      <w:r>
-        <w:t xml:space="preserve">Verification status: Planned (website step R4; iPad app Phase 5); to verify</w:t>
-      </w:r>
-    </w:p>
-    <w:p>
-      <w:pPr>
-        <w:pStyle w:val="Heading1"/>
-      </w:pPr>
-      <w:r>
-        <w:t xml:space="preserve">11. Groceries, cooking and printing</w:t>
+        <w:t xml:space="preserve">8. Groceries and the kitchen</w:t>
       </w:r>
     </w:p>
     <w:p>
@@ -1830,17 +1548,17 @@
     </w:p>
     <w:p>
       <w:r>
-        <w:t xml:space="preserve">One shared grocery list, not sorted by aisle or date. “Add to Groceries” on a recipe adds its ingredients at the current serving size, each showing the recipe's small thumbnail; + adds an item by hand. Items are checked off with a tap; “Clear checked” and “Clear all” empty the list. An optional Group by recipe switch groups items under their recipe. The list is the same on the website and in the app.</w:t>
+        <w:t xml:space="preserve">One shared list, not sorted by aisle or date. Add to Groceries on a recipe opens a sheet of its ingredients at the current serving size, all ticked, to untick what's at home. Items show in handwriting with the recipe's thumbnail; checked items move to the bottom; Add an item, Clear checked, Clear all; Group by recipe (remembered per browser). Locked browsers see it read-only.</w:t>
       </w:r>
     </w:p>
     <w:p>
       <w:r>
-        <w:t xml:space="preserve">Acceptance: Adding the sweet chili chicken at 8 servings adds 14 items with doubled amounts; checking one off on the iPad shows it checked on the website.</w:t>
+        <w:t xml:space="preserve">Acceptance: Adding the sweet chili chicken at 6 servings adds its 14 items scaled; a check-off on one device shows on the other.</w:t>
       </w:r>
     </w:p>
     <w:p>
       <w:r>
-        <w:t xml:space="preserve">Verification status: Planned (website step R4; iPad app Phase 5); to verify</w:t>
+        <w:t xml:space="preserve">Verification status: Deployed 2026-10-28; in use by the owner</w:t>
       </w:r>
     </w:p>
     <w:p>
@@ -1853,17 +1571,17 @@
     </w:p>
     <w:p>
       <w:r>
-        <w:t xml:space="preserve">Start Cooking shows one step at a time in large handwriting, with that step's ingredients above it. Tap or swipe moves to the next step, steps can be checked off, and the screen stays awake. Reaching the last step adds one to times cooked.</w:t>
+        <w:t xml:space="preserve">Full screen: “Gather your ingredients” (a checklist at the current scale), then one step at a time in large handwriting with the ingredients it uses above it. Next/Back, swipe or arrow keys; sub-steps check off; the screen stays awake. The last page, “enjoy!”, adds one to times cooked. Where it was left is remembered for Home (FR-HOME-001).</w:t>
       </w:r>
     </w:p>
     <w:p>
       <w:r>
-        <w:t xml:space="preserve">Acceptance: The screen does not dim during Start Cooking; finishing the last step raises the times-cooked count by one.</w:t>
+        <w:t xml:space="preserve">Acceptance: The screen doesn't dim; reaching the end raises times cooked by one.</w:t>
       </w:r>
     </w:p>
     <w:p>
       <w:r>
-        <w:t xml:space="preserve">Verification status: Planned (website step R4; iPad app Phase 5); to verify</w:t>
+        <w:t xml:space="preserve">Verification status: Deployed 2026-10-28</w:t>
       </w:r>
     </w:p>
     <w:p>
@@ -1876,17 +1594,25 @@
     </w:p>
     <w:p>
       <w:r>
-        <w:t xml:space="preserve">Changing servings scales every ingredient that has a parsed amount; ingredients without an amount are unchanged. Scaled amounts are shown as kitchen fractions.</w:t>
+        <w:t xml:space="preserve">− and + on Servings (or ×½ to ×4 without a serving count) rescale amounts with kitchen fractions (⅓ c × 1½ = ½ c); unparsed lines stay as written. Add to Groceries and Start Cooking use the scaled amounts.</w:t>
       </w:r>
     </w:p>
     <w:p>
       <w:r>
-        <w:t xml:space="preserve">Acceptance: Going from 4 to 8 servings shows “⅔ c sweet chili sauce”; “pinch of salt” is unchanged.</w:t>
+        <w:t xml:space="preserve">Acceptance: 4 → 6 servings shows ½ c sweet chili sauce and 3 lbs chicken.</w:t>
       </w:r>
     </w:p>
     <w:p>
       <w:r>
-        <w:t xml:space="preserve">Verification status: Planned (website step R4; iPad app Phase 5); to verify</w:t>
+        <w:t xml:space="preserve">Verification status: Deployed 2026-10-28</w:t>
+      </w:r>
+    </w:p>
+    <w:p>
+      <w:pPr>
+        <w:pStyle w:val="Heading1"/>
+      </w:pPr>
+      <w:r>
+        <w:t xml:space="preserve">9. Offline and live updates</w:t>
       </w:r>
     </w:p>
     <w:p>
@@ -1894,22 +1620,22 @@
         <w:pStyle w:val="Heading2"/>
       </w:pPr>
       <w:r>
-        <w:t xml:space="preserve">FR-PRINT-001  Printed card</w:t>
+        <w:t xml:space="preserve">FR-OFF-001  Opened pages work offline</w:t>
       </w:r>
     </w:p>
     <w:p>
       <w:r>
-        <w:t xml:space="preserve">Printing a recipe from the website prints only the page on a white background, without tabs, navigation, the spiral, or stickers. The app can share a recipe as a PDF.</w:t>
+        <w:t xml:space="preserve">Pages opened on a device (recipes, Home, Library, Groceries, the book) and their pictures are kept by the browser and still open with no signal. A note says “You’re offline”. A page never opened on that device shows a friendly offline page.</w:t>
       </w:r>
     </w:p>
     <w:p>
       <w:r>
-        <w:t xml:space="preserve">Acceptance: A printed sweet chili chicken page fits the full recipe and shows no navigation.</w:t>
+        <w:t xml:space="preserve">Acceptance: With no connection, a recipe opened earlier opens with its photo; an unopened one shows the offline page.</w:t>
       </w:r>
     </w:p>
     <w:p>
       <w:r>
-        <w:t xml:space="preserve">Verification status: Website print rules deployed 2026-10-27, full check planned (website step R5); app PDF planned (Phase 5)</w:t>
+        <w:t xml:space="preserve">Verification status: Built 2026-10-29, not yet deployed; checked in WebKit with an iPad profile (and headless Chrome); owner check pending (tested offline in Chrome; WebKit test tools can't run service workers)</w:t>
       </w:r>
     </w:p>
     <w:p>
@@ -1917,22 +1643,91 @@
         <w:pStyle w:val="Heading2"/>
       </w:pPr>
       <w:r>
-        <w:t xml:space="preserve">FR-PWA-001  Website on the Home Screen and offline</w:t>
+        <w:t xml:space="preserve">FR-OFF-002  Check off groceries with no signal</w:t>
       </w:r>
     </w:p>
     <w:p>
       <w:r>
-        <w:t xml:space="preserve">The website can be added to any phone or tablet's Home Screen with its own icon and opens full screen. Recently viewed recipes still open without a connection.</w:t>
+        <w:t xml:space="preserve">Check-offs made offline (or whose save can't get through) are kept on the device, shown as checked, and sent when the connection is back; a note counts them. Adding and clearing need a connection.</w:t>
       </w:r>
     </w:p>
     <w:p>
       <w:r>
-        <w:t xml:space="preserve">Acceptance: In airplane mode, a recipe opened earlier still opens from the website's Home Screen icon.</w:t>
+        <w:t xml:space="preserve">Acceptance: Offline, a check-off survives a reload and is sent after reconnecting.</w:t>
       </w:r>
     </w:p>
     <w:p>
       <w:r>
-        <w:t xml:space="preserve">Verification status: Planned (website build-order step R5); to verify</w:t>
+        <w:t xml:space="preserve">Verification status: Built 2026-10-29, not yet deployed; checked in WebKit with an iPad profile (and headless Chrome); owner check pending</w:t>
+      </w:r>
+    </w:p>
+    <w:p>
+      <w:pPr>
+        <w:pStyle w:val="Heading2"/>
+      </w:pPr>
+      <w:r>
+        <w:t xml:space="preserve">FR-LIVE-001  Live updates</w:t>
+      </w:r>
+    </w:p>
+    <w:p>
+      <w:r>
+        <w:t xml:space="preserve">When a recipe, the grocery list or the week's meals change on any device, every open page refreshes within about a second, keeping what's typed and the scroll position. Pages also refresh when brought back to the front or when the connection returns.</w:t>
+      </w:r>
+    </w:p>
+    <w:p>
+      <w:r>
+        <w:t xml:space="preserve">Acceptance: A check-off on the iPad shows on the open Mac within a second or two.</w:t>
+      </w:r>
+    </w:p>
+    <w:p>
+      <w:r>
+        <w:t xml:space="preserve">Verification status: Built 2026-10-29, not yet deployed; checked in WebKit with an iPad profile (and headless Chrome); owner check pending; needs migration 003 (run by the owner)</w:t>
+      </w:r>
+    </w:p>
+    <w:p>
+      <w:pPr>
+        <w:pStyle w:val="Heading2"/>
+      </w:pPr>
+      <w:r>
+        <w:t xml:space="preserve">FR-PWA-002  Full-screen Home Screen app (decision pending)</w:t>
+      </w:r>
+    </w:p>
+    <w:p>
+      <w:r>
+        <w:t xml:space="preserve">Opening the Home Screen shortcut as a full-screen app without Safari's address bar. Under consideration; see the Technical Specification, section 8.</w:t>
+      </w:r>
+    </w:p>
+    <w:p>
+      <w:r>
+        <w:t xml:space="preserve">Acceptance: Not specified until decided.</w:t>
+      </w:r>
+    </w:p>
+    <w:p>
+      <w:r>
+        <w:t xml:space="preserve">Verification status: Proposed (website step R5)</w:t>
+      </w:r>
+    </w:p>
+    <w:p>
+      <w:pPr>
+        <w:pStyle w:val="Heading2"/>
+      </w:pPr>
+      <w:r>
+        <w:t xml:space="preserve">FR-PRINT-001  Printed recipe</w:t>
+      </w:r>
+    </w:p>
+    <w:p>
+      <w:r>
+        <w:t xml:space="preserve">Printing a recipe prints the recipe only, on white, without navigation, buttons or decorations.</w:t>
+      </w:r>
+    </w:p>
+    <w:p>
+      <w:r>
+        <w:t xml:space="preserve">Acceptance: A printed recipe shows no navigation or bottom buttons.</w:t>
+      </w:r>
+    </w:p>
+    <w:p>
+      <w:r>
+        <w:t xml:space="preserve">Verification status: Print rules deployed 2026-10-27; full check planned (website step R5)</w:t>
       </w:r>
     </w:p>
     <w:p>
@@ -1940,7 +1735,7 @@
         <w:pStyle w:val="Heading1"/>
       </w:pPr>
       <w:r>
-        <w:t xml:space="preserve">12. Error handling, usability and consistency</w:t>
+        <w:t xml:space="preserve">10. Error handling, usability and consistency</w:t>
       </w:r>
     </w:p>
     <w:p>
@@ -1953,12 +1748,12 @@
     </w:p>
     <w:p>
       <w:r>
-        <w:t xml:space="preserve">An unknown or deleted recipe, or an unknown category address, shows the not-found page rather than an error.</w:t>
+        <w:t xml:space="preserve">An unknown or deleted recipe shows the not-found page rather than an error.</w:t>
       </w:r>
     </w:p>
     <w:p>
       <w:r>
-        <w:t xml:space="preserve">Acceptance: /recipe/does-not-exist and /category/soups show the not-found page.</w:t>
+        <w:t xml:space="preserve">Acceptance: /recipe/does-not-exist shows the not-found page.</w:t>
       </w:r>
     </w:p>
     <w:p>
@@ -1971,22 +1766,22 @@
         <w:pStyle w:val="Heading2"/>
       </w:pPr>
       <w:r>
-        <w:t xml:space="preserve">FR-UX-002  Phones and tablets</w:t>
+        <w:t xml:space="preserve">FR-UX-002  Safari on iPad first</w:t>
       </w:r>
     </w:p>
     <w:p>
       <w:r>
-        <w:t xml:space="preserve">Every website page works from phone width (390px) to a landscape iPad and desktop, with no sideways scrolling.</w:t>
+        <w:t xml:space="preserve">Every page works in Safari on iPad in portrait and landscape, and from phone width (390px) to desktop, with no sideways scrolling.</w:t>
       </w:r>
     </w:p>
     <w:p>
       <w:r>
-        <w:t xml:space="preserve">Acceptance: No horizontal scroll at 390px, 768px, 1024px and 1280px widths.</w:t>
+        <w:t xml:space="preserve">Acceptance: No horizontal scroll on any page in WebKit with iPad Pro 11" portrait and landscape profiles.</w:t>
       </w:r>
     </w:p>
     <w:p>
       <w:r>
-        <w:t xml:space="preserve">Verification status: Deployed 2026-10-27; checked at 500px and 1100px in headless Chrome; 390px and real iPad check pending</w:t>
+        <w:t xml:space="preserve">Verification status: Deployed at https://ramiyas-recipes.vercel.app (main at 19be9f4, 2026-10-29); checked in WebKit with an iPad profile and in headless Chrome; owner check on the iPad pending</w:t>
       </w:r>
     </w:p>
     <w:p>
@@ -1999,17 +1794,17 @@
     </w:p>
     <w:p>
       <w:r>
-        <w:t xml:space="preserve">Pages use real headings and lists; decorations are hidden from screen readers; checked tags are announced as checked; text meets contrast guidelines.</w:t>
+        <w:t xml:space="preserve">Real headings and lists; decorations hidden from screen readers; checked states and pressed filters announced; text meets contrast guidelines.</w:t>
       </w:r>
     </w:p>
     <w:p>
       <w:r>
-        <w:t xml:space="preserve">Acceptance: A screen reader reads the recipe page in book order: title, stats, tags, ingredients, directions.</w:t>
+        <w:t xml:space="preserve">Acceptance: VoiceOver reads a recipe in order: title, stats, tags, ingredients, directions.</w:t>
       </w:r>
     </w:p>
     <w:p>
       <w:r>
-        <w:t xml:space="preserve">Verification status: Website deployed 2026-10-27; to verify with VoiceOver</w:t>
+        <w:t xml:space="preserve">Verification status: Deployed; to verify with VoiceOver</w:t>
       </w:r>
     </w:p>
     <w:p>
@@ -2022,17 +1817,17 @@
     </w:p>
     <w:p>
       <w:r>
-        <w:t xml:space="preserve">Saving, importing, uploading and scanning show clear success and error messages, and buttons are disabled while an action is running.</w:t>
+        <w:t xml:space="preserve">Saving, importing, uploading, favorites and meals show clear success and error messages; buttons are disabled while working; failed check-offs and favorites roll back with a message that disappears by itself.</w:t>
       </w:r>
     </w:p>
     <w:p>
       <w:r>
-        <w:t xml:space="preserve">Acceptance: A failed upload shows an error and keeps what the cook has written.</w:t>
+        <w:t xml:space="preserve">Acceptance: A refused save shows “Editing is locked on this device. Unlock it in Settings.” and keeps the draft.</w:t>
       </w:r>
     </w:p>
     <w:p>
       <w:r>
-        <w:t xml:space="preserve">Verification status: Planned (website step R2; iPad app Phase 3); to verify</w:t>
+        <w:t xml:space="preserve">Verification status: Deployed at https://ramiyas-recipes.vercel.app (main at 19be9f4, 2026-10-29); checked in WebKit with an iPad profile and in headless Chrome; owner check on the iPad pending</w:t>
       </w:r>
     </w:p>
     <w:p>
@@ -2040,7 +1835,7 @@
         <w:pStyle w:val="Heading1"/>
       </w:pPr>
       <w:r>
-        <w:t xml:space="preserve">13. Functional acceptance test matrix</w:t>
+        <w:t xml:space="preserve">11. Functional acceptance test matrix</w:t>
       </w:r>
     </w:p>
     <w:tbl>
@@ -2139,7 +1934,7 @@
               <w:rPr>
                 <w:sz w:val="16"/>
               </w:rPr>
-              <w:t xml:space="preserve">Open the sweet chili chicken page</w:t>
+              <w:t xml:space="preserve">Open the sweet chili chicken</w:t>
             </w:r>
           </w:p>
         </w:tc>
@@ -2156,7 +1951,7 @@
               <w:rPr>
                 <w:sz w:val="16"/>
               </w:rPr>
-              <w:t xml:space="preserve">Title, asterisk, stats, tags, ingredients and directions match the reference photo</w:t>
+              <w:t xml:space="preserve">14 ingredients in 3 groups, 4 steps with sub-steps, in handwriting</w:t>
             </w:r>
           </w:p>
         </w:tc>
@@ -2192,7 +1987,7 @@
               <w:rPr>
                 <w:sz w:val="16"/>
               </w:rPr>
-              <w:t xml:space="preserve">Ingredient columns on a wide screen</w:t>
+              <w:t xml:space="preserve">Tall cover photo</w:t>
             </w:r>
           </w:p>
         </w:tc>
@@ -2209,7 +2004,7 @@
               <w:rPr>
                 <w:sz w:val="16"/>
               </w:rPr>
-              <w:t xml:space="preserve">Marinade left; drizzle, blank line and cooked rice right; columns equal height</w:t>
+              <w:t xml:space="preserve">Shown whole, not cropped</w:t>
             </w:r>
           </w:p>
         </w:tc>
@@ -2245,7 +2040,7 @@
               <w:rPr>
                 <w:sz w:val="16"/>
               </w:rPr>
-              <w:t xml:space="preserve">Ingredient columns on a phone</w:t>
+              <w:t xml:space="preserve">Library star (unlocked)</w:t>
             </w:r>
           </w:p>
         </w:tc>
@@ -2262,7 +2057,7 @@
               <w:rPr>
                 <w:sz w:val="16"/>
               </w:rPr>
-              <w:t xml:space="preserve">One column, groups in order, no padding lines between groups</w:t>
+              <w:t xml:space="preserve">Toggles Favorites without opening the recipe; ★ Favorites filters</w:t>
             </w:r>
           </w:p>
         </w:tc>
@@ -2298,7 +2093,7 @@
               <w:rPr>
                 <w:sz w:val="16"/>
               </w:rPr>
-              <w:t xml:space="preserve">Fraction display</w:t>
+              <w:t xml:space="preserve">Library category tab</w:t>
             </w:r>
           </w:p>
         </w:tc>
@@ -2315,7 +2110,7 @@
               <w:rPr>
                 <w:sz w:val="16"/>
               </w:rPr>
-              <w:t xml:space="preserve">1/3 shows as ⅓ and 1/2 as ½; the stored value is unchanged</w:t>
+              <w:t xml:space="preserve">Only that category's recipes; /category/mains leads here</w:t>
             </w:r>
           </w:p>
         </w:tc>
@@ -2351,7 +2146,7 @@
               <w:rPr>
                 <w:sz w:val="16"/>
               </w:rPr>
-              <w:t xml:space="preserve">Select the Desserts tab</w:t>
+              <w:t xml:space="preserve">List | Book → Book in landscape</w:t>
             </w:r>
           </w:p>
         </w:tc>
@@ -2368,7 +2163,7 @@
               <w:rPr>
                 <w:sz w:val="16"/>
               </w:rPr>
-              <w:t xml:space="preserve">Desserts page opens and shows only dessert recipes (none yet)</w:t>
+              <w:t xml:space="preserve">Cover alone on the right; pages turn; tabs jump</w:t>
             </w:r>
           </w:p>
         </w:tc>
@@ -2404,7 +2199,7 @@
               <w:rPr>
                 <w:sz w:val="16"/>
               </w:rPr>
-              <w:t xml:space="preserve">Unknown or deleted recipe address</w:t>
+              <w:t xml:space="preserve">Write on the lines with Scribble</w:t>
             </w:r>
           </w:p>
         </w:tc>
@@ -2421,7 +2216,7 @@
               <w:rPr>
                 <w:sz w:val="16"/>
               </w:rPr>
-              <w:t xml:space="preserve">Not-found page</w:t>
+              <w:t xml:space="preserve">Each line fills; Return moves on with the keyboard up</w:t>
             </w:r>
           </w:p>
         </w:tc>
@@ -2457,7 +2252,7 @@
               <w:rPr>
                 <w:sz w:val="16"/>
               </w:rPr>
-              <w:t xml:space="preserve">Device in dark mode</w:t>
+              <w:t xml:space="preserve">Write two Pencil pages and save</w:t>
             </w:r>
           </w:p>
         </w:tc>
@@ -2474,7 +2269,7 @@
               <w:rPr>
                 <w:sz w:val="16"/>
               </w:rPr>
-              <w:t xml:space="preserve">Still white and cream backgrounds with dark text (light only)</w:t>
+              <w:t xml:space="preserve">One handwritten page with both; recipe view shows it</w:t>
             </w:r>
           </w:p>
         </w:tc>
@@ -2510,7 +2305,7 @@
               <w:rPr>
                 <w:sz w:val="16"/>
               </w:rPr>
-              <w:t xml:space="preserve">Print the recipe page</w:t>
+              <w:t xml:space="preserve">Type the lines</w:t>
             </w:r>
           </w:p>
         </w:tc>
@@ -2527,7 +2322,7 @@
               <w:rPr>
                 <w:sz w:val="16"/>
               </w:rPr>
-              <w:t xml:space="preserve">Page only, white background, no tabs, spiral or stickers</w:t>
+              <w:t xml:space="preserve">Lines beside the handwritten page; Paste text works with Live Text</w:t>
             </w:r>
           </w:p>
         </w:tc>
@@ -2547,6 +2342,377 @@
                 <w:sz w:val="16"/>
               </w:rPr>
               <w:t xml:space="preserve">AT-09</w:t>
+            </w:r>
+          </w:p>
+        </w:tc>
+        <w:tc>
+          <w:tcPr>
+            <w:tcW w:type="dxa" w:w="2880"/>
+            <w:vAlign w:val="center"/>
+          </w:tcPr>
+          <w:p>
+            <w:pPr>
+              <w:spacing w:after="20"/>
+            </w:pPr>
+            <w:r>
+              <w:rPr>
+                <w:sz w:val="16"/>
+              </w:rPr>
+              <w:t xml:space="preserve">Paste the banana bread card's Live Text</w:t>
+            </w:r>
+          </w:p>
+        </w:tc>
+        <w:tc>
+          <w:tcPr>
+            <w:tcW w:type="dxa" w:w="5256"/>
+            <w:vAlign w:val="center"/>
+          </w:tcPr>
+          <w:p>
+            <w:pPr>
+              <w:spacing w:after="20"/>
+            </w:pPr>
+            <w:r>
+              <w:rPr>
+                <w:sz w:val="16"/>
+              </w:rPr>
+              <w:t xml:space="preserve">10 ingredients (170 g, 6 g, 2 oz restored) and 5 steps</w:t>
+            </w:r>
+          </w:p>
+        </w:tc>
+      </w:tr>
+      <w:tr>
+        <w:tc>
+          <w:tcPr>
+            <w:tcW w:type="dxa" w:w="1080"/>
+            <w:vAlign w:val="center"/>
+          </w:tcPr>
+          <w:p>
+            <w:pPr>
+              <w:spacing w:after="20"/>
+            </w:pPr>
+            <w:r>
+              <w:rPr>
+                <w:sz w:val="16"/>
+              </w:rPr>
+              <w:t xml:space="preserve">AT-10</w:t>
+            </w:r>
+          </w:p>
+        </w:tc>
+        <w:tc>
+          <w:tcPr>
+            <w:tcW w:type="dxa" w:w="2880"/>
+            <w:vAlign w:val="center"/>
+          </w:tcPr>
+          <w:p>
+            <w:pPr>
+              <w:spacing w:after="20"/>
+            </w:pPr>
+            <w:r>
+              <w:rPr>
+                <w:sz w:val="16"/>
+              </w:rPr>
+              <w:t xml:space="preserve">Save from a recipe-site link</w:t>
+            </w:r>
+          </w:p>
+        </w:tc>
+        <w:tc>
+          <w:tcPr>
+            <w:tcW w:type="dxa" w:w="5256"/>
+            <w:vAlign w:val="center"/>
+          </w:tcPr>
+          <w:p>
+            <w:pPr>
+              <w:spacing w:after="20"/>
+            </w:pPr>
+            <w:r>
+              <w:rPr>
+                <w:sz w:val="16"/>
+              </w:rPr>
+              <w:t xml:space="preserve">Title, photo, ingredients and steps for review; Check this import</w:t>
+            </w:r>
+          </w:p>
+        </w:tc>
+      </w:tr>
+      <w:tr>
+        <w:tc>
+          <w:tcPr>
+            <w:tcW w:type="dxa" w:w="1080"/>
+            <w:vAlign w:val="center"/>
+          </w:tcPr>
+          <w:p>
+            <w:pPr>
+              <w:spacing w:after="20"/>
+            </w:pPr>
+            <w:r>
+              <w:rPr>
+                <w:sz w:val="16"/>
+              </w:rPr>
+              <w:t xml:space="preserve">AT-11</w:t>
+            </w:r>
+          </w:p>
+        </w:tc>
+        <w:tc>
+          <w:tcPr>
+            <w:tcW w:type="dxa" w:w="2880"/>
+            <w:vAlign w:val="center"/>
+          </w:tcPr>
+          <w:p>
+            <w:pPr>
+              <w:spacing w:after="20"/>
+            </w:pPr>
+            <w:r>
+              <w:rPr>
+                <w:sz w:val="16"/>
+              </w:rPr>
+              <w:t xml:space="preserve">Plan two recipes and add the week to Groceries</w:t>
+            </w:r>
+          </w:p>
+        </w:tc>
+        <w:tc>
+          <w:tcPr>
+            <w:tcW w:type="dxa" w:w="5256"/>
+            <w:vAlign w:val="center"/>
+          </w:tcPr>
+          <w:p>
+            <w:pPr>
+              <w:spacing w:after="20"/>
+            </w:pPr>
+            <w:r>
+              <w:rPr>
+                <w:sz w:val="16"/>
+              </w:rPr>
+              <w:t xml:space="preserve">Two sections, scaled; lines linked to recipes</w:t>
+            </w:r>
+          </w:p>
+        </w:tc>
+      </w:tr>
+      <w:tr>
+        <w:tc>
+          <w:tcPr>
+            <w:tcW w:type="dxa" w:w="1080"/>
+            <w:vAlign w:val="center"/>
+          </w:tcPr>
+          <w:p>
+            <w:pPr>
+              <w:spacing w:after="20"/>
+            </w:pPr>
+            <w:r>
+              <w:rPr>
+                <w:sz w:val="16"/>
+              </w:rPr>
+              <w:t xml:space="preserve">AT-12</w:t>
+            </w:r>
+          </w:p>
+        </w:tc>
+        <w:tc>
+          <w:tcPr>
+            <w:tcW w:type="dxa" w:w="2880"/>
+            <w:vAlign w:val="center"/>
+          </w:tcPr>
+          <w:p>
+            <w:pPr>
+              <w:spacing w:after="20"/>
+            </w:pPr>
+            <w:r>
+              <w:rPr>
+                <w:sz w:val="16"/>
+              </w:rPr>
+              <w:t xml:space="preserve">Leave Start Cooking at step 2, open Home</w:t>
+            </w:r>
+          </w:p>
+        </w:tc>
+        <w:tc>
+          <w:tcPr>
+            <w:tcW w:type="dxa" w:w="5256"/>
+            <w:vAlign w:val="center"/>
+          </w:tcPr>
+          <w:p>
+            <w:pPr>
+              <w:spacing w:after="20"/>
+            </w:pPr>
+            <w:r>
+              <w:rPr>
+                <w:sz w:val="16"/>
+              </w:rPr>
+              <w:t xml:space="preserve">Continue cooking: step 2 of N, at the same scale</w:t>
+            </w:r>
+          </w:p>
+        </w:tc>
+      </w:tr>
+      <w:tr>
+        <w:tc>
+          <w:tcPr>
+            <w:tcW w:type="dxa" w:w="1080"/>
+            <w:vAlign w:val="center"/>
+          </w:tcPr>
+          <w:p>
+            <w:pPr>
+              <w:spacing w:after="20"/>
+            </w:pPr>
+            <w:r>
+              <w:rPr>
+                <w:sz w:val="16"/>
+              </w:rPr>
+              <w:t xml:space="preserve">AT-13</w:t>
+            </w:r>
+          </w:p>
+        </w:tc>
+        <w:tc>
+          <w:tcPr>
+            <w:tcW w:type="dxa" w:w="2880"/>
+            <w:vAlign w:val="center"/>
+          </w:tcPr>
+          <w:p>
+            <w:pPr>
+              <w:spacing w:after="20"/>
+            </w:pPr>
+            <w:r>
+              <w:rPr>
+                <w:sz w:val="16"/>
+              </w:rPr>
+              <w:t xml:space="preserve">Airplane mode, open a recipe opened earlier</w:t>
+            </w:r>
+          </w:p>
+        </w:tc>
+        <w:tc>
+          <w:tcPr>
+            <w:tcW w:type="dxa" w:w="5256"/>
+            <w:vAlign w:val="center"/>
+          </w:tcPr>
+          <w:p>
+            <w:pPr>
+              <w:spacing w:after="20"/>
+            </w:pPr>
+            <w:r>
+              <w:rPr>
+                <w:sz w:val="16"/>
+              </w:rPr>
+              <w:t xml:space="preserve">It opens with its photo; offline note shows</w:t>
+            </w:r>
+          </w:p>
+        </w:tc>
+      </w:tr>
+      <w:tr>
+        <w:tc>
+          <w:tcPr>
+            <w:tcW w:type="dxa" w:w="1080"/>
+            <w:vAlign w:val="center"/>
+          </w:tcPr>
+          <w:p>
+            <w:pPr>
+              <w:spacing w:after="20"/>
+            </w:pPr>
+            <w:r>
+              <w:rPr>
+                <w:sz w:val="16"/>
+              </w:rPr>
+              <w:t xml:space="preserve">AT-14</w:t>
+            </w:r>
+          </w:p>
+        </w:tc>
+        <w:tc>
+          <w:tcPr>
+            <w:tcW w:type="dxa" w:w="2880"/>
+            <w:vAlign w:val="center"/>
+          </w:tcPr>
+          <w:p>
+            <w:pPr>
+              <w:spacing w:after="20"/>
+            </w:pPr>
+            <w:r>
+              <w:rPr>
+                <w:sz w:val="16"/>
+              </w:rPr>
+              <w:t xml:space="preserve">Airplane mode, check off groceries, reconnect</w:t>
+            </w:r>
+          </w:p>
+        </w:tc>
+        <w:tc>
+          <w:tcPr>
+            <w:tcW w:type="dxa" w:w="5256"/>
+            <w:vAlign w:val="center"/>
+          </w:tcPr>
+          <w:p>
+            <w:pPr>
+              <w:spacing w:after="20"/>
+            </w:pPr>
+            <w:r>
+              <w:rPr>
+                <w:sz w:val="16"/>
+              </w:rPr>
+              <w:t xml:space="preserve">Check-offs kept, then saved</w:t>
+            </w:r>
+          </w:p>
+        </w:tc>
+      </w:tr>
+      <w:tr>
+        <w:tc>
+          <w:tcPr>
+            <w:tcW w:type="dxa" w:w="1080"/>
+            <w:vAlign w:val="center"/>
+          </w:tcPr>
+          <w:p>
+            <w:pPr>
+              <w:spacing w:after="20"/>
+            </w:pPr>
+            <w:r>
+              <w:rPr>
+                <w:sz w:val="16"/>
+              </w:rPr>
+              <w:t xml:space="preserve">AT-15</w:t>
+            </w:r>
+          </w:p>
+        </w:tc>
+        <w:tc>
+          <w:tcPr>
+            <w:tcW w:type="dxa" w:w="2880"/>
+            <w:vAlign w:val="center"/>
+          </w:tcPr>
+          <w:p>
+            <w:pPr>
+              <w:spacing w:after="20"/>
+            </w:pPr>
+            <w:r>
+              <w:rPr>
+                <w:sz w:val="16"/>
+              </w:rPr>
+              <w:t xml:space="preserve">Change on the iPad with the Mac open</w:t>
+            </w:r>
+          </w:p>
+        </w:tc>
+        <w:tc>
+          <w:tcPr>
+            <w:tcW w:type="dxa" w:w="5256"/>
+            <w:vAlign w:val="center"/>
+          </w:tcPr>
+          <w:p>
+            <w:pPr>
+              <w:spacing w:after="20"/>
+            </w:pPr>
+            <w:r>
+              <w:rPr>
+                <w:sz w:val="16"/>
+              </w:rPr>
+              <w:t xml:space="preserve">The Mac's page updates within a second or two</w:t>
+            </w:r>
+          </w:p>
+        </w:tc>
+      </w:tr>
+      <w:tr>
+        <w:tc>
+          <w:tcPr>
+            <w:tcW w:type="dxa" w:w="1080"/>
+            <w:vAlign w:val="center"/>
+          </w:tcPr>
+          <w:p>
+            <w:pPr>
+              <w:spacing w:after="20"/>
+            </w:pPr>
+            <w:r>
+              <w:rPr>
+                <w:sz w:val="16"/>
+              </w:rPr>
+              <w:t xml:space="preserve">AT-16</w:t>
             </w:r>
           </w:p>
         </w:tc>
@@ -2599,377 +2765,6 @@
               <w:rPr>
                 <w:sz w:val="16"/>
               </w:rPr>
-              <w:t xml:space="preserve">AT-10</w:t>
-            </w:r>
-          </w:p>
-        </w:tc>
-        <w:tc>
-          <w:tcPr>
-            <w:tcW w:type="dxa" w:w="2880"/>
-            <w:vAlign w:val="center"/>
-          </w:tcPr>
-          <w:p>
-            <w:pPr>
-              <w:spacing w:after="20"/>
-            </w:pPr>
-            <w:r>
-              <w:rPr>
-                <w:sz w:val="16"/>
-              </w:rPr>
-              <w:t xml:space="preserve">Save or delete in the app</w:t>
-            </w:r>
-          </w:p>
-        </w:tc>
-        <w:tc>
-          <w:tcPr>
-            <w:tcW w:type="dxa" w:w="5256"/>
-            <w:vAlign w:val="center"/>
-          </w:tcPr>
-          <w:p>
-            <w:pPr>
-              <w:spacing w:after="20"/>
-            </w:pPr>
-            <w:r>
-              <w:rPr>
-                <w:sz w:val="16"/>
-              </w:rPr>
-              <w:t xml:space="preserve">The website shows the change within about a minute</w:t>
-            </w:r>
-          </w:p>
-        </w:tc>
-      </w:tr>
-      <w:tr>
-        <w:tc>
-          <w:tcPr>
-            <w:tcW w:type="dxa" w:w="1080"/>
-            <w:vAlign w:val="center"/>
-          </w:tcPr>
-          <w:p>
-            <w:pPr>
-              <w:spacing w:after="20"/>
-            </w:pPr>
-            <w:r>
-              <w:rPr>
-                <w:sz w:val="16"/>
-              </w:rPr>
-              <w:t xml:space="preserve">AT-11</w:t>
-            </w:r>
-          </w:p>
-        </w:tc>
-        <w:tc>
-          <w:tcPr>
-            <w:tcW w:type="dxa" w:w="2880"/>
-            <w:vAlign w:val="center"/>
-          </w:tcPr>
-          <w:p>
-            <w:pPr>
-              <w:spacing w:after="20"/>
-            </w:pPr>
-            <w:r>
-              <w:rPr>
-                <w:sz w:val="16"/>
-              </w:rPr>
-              <w:t xml:space="preserve">App 10 days after install, no cable</w:t>
-            </w:r>
-          </w:p>
-        </w:tc>
-        <w:tc>
-          <w:tcPr>
-            <w:tcW w:type="dxa" w:w="5256"/>
-            <w:vAlign w:val="center"/>
-          </w:tcPr>
-          <w:p>
-            <w:pPr>
-              <w:spacing w:after="20"/>
-            </w:pPr>
-            <w:r>
-              <w:rPr>
-                <w:sz w:val="16"/>
-              </w:rPr>
-              <w:t xml:space="preserve">Still opens; SideStore expiry date keeps moving forward</w:t>
-            </w:r>
-          </w:p>
-        </w:tc>
-      </w:tr>
-      <w:tr>
-        <w:tc>
-          <w:tcPr>
-            <w:tcW w:type="dxa" w:w="1080"/>
-            <w:vAlign w:val="center"/>
-          </w:tcPr>
-          <w:p>
-            <w:pPr>
-              <w:spacing w:after="20"/>
-            </w:pPr>
-            <w:r>
-              <w:rPr>
-                <w:sz w:val="16"/>
-              </w:rPr>
-              <w:t xml:space="preserve">AT-12</w:t>
-            </w:r>
-          </w:p>
-        </w:tc>
-        <w:tc>
-          <w:tcPr>
-            <w:tcW w:type="dxa" w:w="2880"/>
-            <w:vAlign w:val="center"/>
-          </w:tcPr>
-          <w:p>
-            <w:pPr>
-              <w:spacing w:after="20"/>
-            </w:pPr>
-            <w:r>
-              <w:rPr>
-                <w:sz w:val="16"/>
-              </w:rPr>
-              <w:t xml:space="preserve">App in airplane mode</w:t>
-            </w:r>
-          </w:p>
-        </w:tc>
-        <w:tc>
-          <w:tcPr>
-            <w:tcW w:type="dxa" w:w="5256"/>
-            <w:vAlign w:val="center"/>
-          </w:tcPr>
-          <w:p>
-            <w:pPr>
-              <w:spacing w:after="20"/>
-            </w:pPr>
-            <w:r>
-              <w:rPr>
-                <w:sz w:val="16"/>
-              </w:rPr>
-              <w:t xml:space="preserve">Every recipe opens; a new recipe saves and syncs after reconnecting</w:t>
-            </w:r>
-          </w:p>
-        </w:tc>
-      </w:tr>
-      <w:tr>
-        <w:tc>
-          <w:tcPr>
-            <w:tcW w:type="dxa" w:w="1080"/>
-            <w:vAlign w:val="center"/>
-          </w:tcPr>
-          <w:p>
-            <w:pPr>
-              <w:spacing w:after="20"/>
-            </w:pPr>
-            <w:r>
-              <w:rPr>
-                <w:sz w:val="16"/>
-              </w:rPr>
-              <w:t xml:space="preserve">AT-13</w:t>
-            </w:r>
-          </w:p>
-        </w:tc>
-        <w:tc>
-          <w:tcPr>
-            <w:tcW w:type="dxa" w:w="2880"/>
-            <w:vAlign w:val="center"/>
-          </w:tcPr>
-          <w:p>
-            <w:pPr>
-              <w:spacing w:after="20"/>
-            </w:pPr>
-            <w:r>
-              <w:rPr>
-                <w:sz w:val="16"/>
-              </w:rPr>
-              <w:t xml:space="preserve">Scribble the recipe on the lines</w:t>
-            </w:r>
-          </w:p>
-        </w:tc>
-        <w:tc>
-          <w:tcPr>
-            <w:tcW w:type="dxa" w:w="5256"/>
-            <w:vAlign w:val="center"/>
-          </w:tcPr>
-          <w:p>
-            <w:pPr>
-              <w:spacing w:after="20"/>
-            </w:pPr>
-            <w:r>
-              <w:rPr>
-                <w:sz w:val="16"/>
-              </w:rPr>
-              <w:t xml:space="preserve">Each line fills, a new line appears, draft survives force-quit</w:t>
-            </w:r>
-          </w:p>
-        </w:tc>
-      </w:tr>
-      <w:tr>
-        <w:tc>
-          <w:tcPr>
-            <w:tcW w:type="dxa" w:w="1080"/>
-            <w:vAlign w:val="center"/>
-          </w:tcPr>
-          <w:p>
-            <w:pPr>
-              <w:spacing w:after="20"/>
-            </w:pPr>
-            <w:r>
-              <w:rPr>
-                <w:sz w:val="16"/>
-              </w:rPr>
-              <w:t xml:space="preserve">AT-14</w:t>
-            </w:r>
-          </w:p>
-        </w:tc>
-        <w:tc>
-          <w:tcPr>
-            <w:tcW w:type="dxa" w:w="2880"/>
-            <w:vAlign w:val="center"/>
-          </w:tcPr>
-          <w:p>
-            <w:pPr>
-              <w:spacing w:after="20"/>
-            </w:pPr>
-            <w:r>
-              <w:rPr>
-                <w:sz w:val="16"/>
-              </w:rPr>
-              <w:t xml:space="preserve">Write the recipe in page mode</w:t>
-            </w:r>
-          </w:p>
-        </w:tc>
-        <w:tc>
-          <w:tcPr>
-            <w:tcW w:type="dxa" w:w="5256"/>
-            <w:vAlign w:val="center"/>
-          </w:tcPr>
-          <w:p>
-            <w:pPr>
-              <w:spacing w:after="20"/>
-            </w:pPr>
-            <w:r>
-              <w:rPr>
-                <w:sz w:val="16"/>
-              </w:rPr>
-              <w:t xml:space="preserve">Recognized text matches after review; handwritten page is kept</w:t>
-            </w:r>
-          </w:p>
-        </w:tc>
-      </w:tr>
-      <w:tr>
-        <w:tc>
-          <w:tcPr>
-            <w:tcW w:type="dxa" w:w="1080"/>
-            <w:vAlign w:val="center"/>
-          </w:tcPr>
-          <w:p>
-            <w:pPr>
-              <w:spacing w:after="20"/>
-            </w:pPr>
-            <w:r>
-              <w:rPr>
-                <w:sz w:val="16"/>
-              </w:rPr>
-              <w:t xml:space="preserve">AT-15</w:t>
-            </w:r>
-          </w:p>
-        </w:tc>
-        <w:tc>
-          <w:tcPr>
-            <w:tcW w:type="dxa" w:w="2880"/>
-            <w:vAlign w:val="center"/>
-          </w:tcPr>
-          <w:p>
-            <w:pPr>
-              <w:spacing w:after="20"/>
-            </w:pPr>
-            <w:r>
-              <w:rPr>
-                <w:sz w:val="16"/>
-              </w:rPr>
-              <w:t xml:space="preserve">Ingredient line “1/3 c sweet chili sauce”</w:t>
-            </w:r>
-          </w:p>
-        </w:tc>
-        <w:tc>
-          <w:tcPr>
-            <w:tcW w:type="dxa" w:w="5256"/>
-            <w:vAlign w:val="center"/>
-          </w:tcPr>
-          <w:p>
-            <w:pPr>
-              <w:spacing w:after="20"/>
-            </w:pPr>
-            <w:r>
-              <w:rPr>
-                <w:sz w:val="16"/>
-              </w:rPr>
-              <w:t xml:space="preserve">Splits into 1/3 | c | sweet chili sauce</w:t>
-            </w:r>
-          </w:p>
-        </w:tc>
-      </w:tr>
-      <w:tr>
-        <w:tc>
-          <w:tcPr>
-            <w:tcW w:type="dxa" w:w="1080"/>
-            <w:vAlign w:val="center"/>
-          </w:tcPr>
-          <w:p>
-            <w:pPr>
-              <w:spacing w:after="20"/>
-            </w:pPr>
-            <w:r>
-              <w:rPr>
-                <w:sz w:val="16"/>
-              </w:rPr>
-              <w:t xml:space="preserve">AT-16</w:t>
-            </w:r>
-          </w:p>
-        </w:tc>
-        <w:tc>
-          <w:tcPr>
-            <w:tcW w:type="dxa" w:w="2880"/>
-            <w:vAlign w:val="center"/>
-          </w:tcPr>
-          <w:p>
-            <w:pPr>
-              <w:spacing w:after="20"/>
-            </w:pPr>
-            <w:r>
-              <w:rPr>
-                <w:sz w:val="16"/>
-              </w:rPr>
-              <w:t xml:space="preserve">Ingredient line “pinch of salt”</w:t>
-            </w:r>
-          </w:p>
-        </w:tc>
-        <w:tc>
-          <w:tcPr>
-            <w:tcW w:type="dxa" w:w="5256"/>
-            <w:vAlign w:val="center"/>
-          </w:tcPr>
-          <w:p>
-            <w:pPr>
-              <w:spacing w:after="20"/>
-            </w:pPr>
-            <w:r>
-              <w:rPr>
-                <w:sz w:val="16"/>
-              </w:rPr>
-              <w:t xml:space="preserve">No amount or unit; whole line is the item</w:t>
-            </w:r>
-          </w:p>
-        </w:tc>
-      </w:tr>
-      <w:tr>
-        <w:tc>
-          <w:tcPr>
-            <w:tcW w:type="dxa" w:w="1080"/>
-            <w:vAlign w:val="center"/>
-          </w:tcPr>
-          <w:p>
-            <w:pPr>
-              <w:spacing w:after="20"/>
-            </w:pPr>
-            <w:r>
-              <w:rPr>
-                <w:sz w:val="16"/>
-              </w:rPr>
               <w:t xml:space="preserve">AT-17</w:t>
             </w:r>
           </w:p>
@@ -2987,7 +2782,7 @@
               <w:rPr>
                 <w:sz w:val="16"/>
               </w:rPr>
-              <w:t xml:space="preserve">Scan the reference page</w:t>
+              <w:t xml:space="preserve">Locked browser</w:t>
             </w:r>
           </w:p>
         </w:tc>
@@ -3004,7 +2799,7 @@
               <w:rPr>
                 <w:sz w:val="16"/>
               </w:rPr>
-              <w:t xml:space="preserve">Title, 2 groups (7 and 6 items), 4 step groups for review; original card kept</w:t>
+              <w:t xml:space="preserve">No +, Edit, star buttons or + Add; unlocking shows them</w:t>
             </w:r>
           </w:p>
         </w:tc>
@@ -3040,7 +2835,7 @@
               <w:rPr>
                 <w:sz w:val="16"/>
               </w:rPr>
-              <w:t xml:space="preserve">Scale 4 → 8 servings</w:t>
+              <w:t xml:space="preserve">Device in dark mode</w:t>
             </w:r>
           </w:p>
         </w:tc>
@@ -3057,7 +2852,7 @@
               <w:rPr>
                 <w:sz w:val="16"/>
               </w:rPr>
-              <w:t xml:space="preserve">Parsed amounts double; unparsed lines unchanged</w:t>
+              <w:t xml:space="preserve">Still white and cream (light only)</w:t>
             </w:r>
           </w:p>
         </w:tc>
@@ -3093,7 +2888,7 @@
               <w:rPr>
                 <w:sz w:val="16"/>
               </w:rPr>
-              <w:t xml:space="preserve">Cook mode</w:t>
+              <w:t xml:space="preserve">New Home Screen shortcut</w:t>
             </w:r>
           </w:p>
         </w:tc>
@@ -3110,325 +2905,7 @@
               <w:rPr>
                 <w:sz w:val="16"/>
               </w:rPr>
-              <w:t xml:space="preserve">Screen stays awake; steps can be checked off</w:t>
-            </w:r>
-          </w:p>
-        </w:tc>
-      </w:tr>
-      <w:tr>
-        <w:tc>
-          <w:tcPr>
-            <w:tcW w:type="dxa" w:w="1080"/>
-            <w:vAlign w:val="center"/>
-          </w:tcPr>
-          <w:p>
-            <w:pPr>
-              <w:spacing w:after="20"/>
-            </w:pPr>
-            <w:r>
-              <w:rPr>
-                <w:sz w:val="16"/>
-              </w:rPr>
-              <w:t xml:space="preserve">AT-20</w:t>
-            </w:r>
-          </w:p>
-        </w:tc>
-        <w:tc>
-          <w:tcPr>
-            <w:tcW w:type="dxa" w:w="2880"/>
-            <w:vAlign w:val="center"/>
-          </w:tcPr>
-          <w:p>
-            <w:pPr>
-              <w:spacing w:after="20"/>
-            </w:pPr>
-            <w:r>
-              <w:rPr>
-                <w:sz w:val="16"/>
-              </w:rPr>
-              <w:t xml:space="preserve">New app release on GitHub</w:t>
-            </w:r>
-          </w:p>
-        </w:tc>
-        <w:tc>
-          <w:tcPr>
-            <w:tcW w:type="dxa" w:w="5256"/>
-            <w:vAlign w:val="center"/>
-          </w:tcPr>
-          <w:p>
-            <w:pPr>
-              <w:spacing w:after="20"/>
-            </w:pPr>
-            <w:r>
-              <w:rPr>
-                <w:sz w:val="16"/>
-              </w:rPr>
-              <w:t xml:space="preserve">SideStore offers the update; recipes are kept after updating</w:t>
-            </w:r>
-          </w:p>
-        </w:tc>
-      </w:tr>
-      <w:tr>
-        <w:tc>
-          <w:tcPr>
-            <w:tcW w:type="dxa" w:w="1080"/>
-            <w:vAlign w:val="center"/>
-          </w:tcPr>
-          <w:p>
-            <w:pPr>
-              <w:spacing w:after="20"/>
-            </w:pPr>
-            <w:r>
-              <w:rPr>
-                <w:sz w:val="16"/>
-              </w:rPr>
-              <w:t xml:space="preserve">AT-21</w:t>
-            </w:r>
-          </w:p>
-        </w:tc>
-        <w:tc>
-          <w:tcPr>
-            <w:tcW w:type="dxa" w:w="2880"/>
-            <w:vAlign w:val="center"/>
-          </w:tcPr>
-          <w:p>
-            <w:pPr>
-              <w:spacing w:after="20"/>
-            </w:pPr>
-            <w:r>
-              <w:rPr>
-                <w:sz w:val="16"/>
-              </w:rPr>
-              <w:t xml:space="preserve">Website from the Home Screen in airplane mode</w:t>
-            </w:r>
-          </w:p>
-        </w:tc>
-        <w:tc>
-          <w:tcPr>
-            <w:tcW w:type="dxa" w:w="5256"/>
-            <w:vAlign w:val="center"/>
-          </w:tcPr>
-          <w:p>
-            <w:pPr>
-              <w:spacing w:after="20"/>
-            </w:pPr>
-            <w:r>
-              <w:rPr>
-                <w:sz w:val="16"/>
-              </w:rPr>
-              <w:t xml:space="preserve">A recently viewed recipe still opens</w:t>
-            </w:r>
-          </w:p>
-        </w:tc>
-      </w:tr>
-      <w:tr>
-        <w:tc>
-          <w:tcPr>
-            <w:tcW w:type="dxa" w:w="1080"/>
-            <w:vAlign w:val="center"/>
-          </w:tcPr>
-          <w:p>
-            <w:pPr>
-              <w:spacing w:after="20"/>
-            </w:pPr>
-            <w:r>
-              <w:rPr>
-                <w:sz w:val="16"/>
-              </w:rPr>
-              <w:t xml:space="preserve">AT-22</w:t>
-            </w:r>
-          </w:p>
-        </w:tc>
-        <w:tc>
-          <w:tcPr>
-            <w:tcW w:type="dxa" w:w="2880"/>
-            <w:vAlign w:val="center"/>
-          </w:tcPr>
-          <w:p>
-            <w:pPr>
-              <w:spacing w:after="20"/>
-            </w:pPr>
-            <w:r>
-              <w:rPr>
-                <w:sz w:val="16"/>
-              </w:rPr>
-              <w:t xml:space="preserve">Library search and filter</w:t>
-            </w:r>
-          </w:p>
-        </w:tc>
-        <w:tc>
-          <w:tcPr>
-            <w:tcW w:type="dxa" w:w="5256"/>
-            <w:vAlign w:val="center"/>
-          </w:tcPr>
-          <w:p>
-            <w:pPr>
-              <w:spacing w:after="20"/>
-            </w:pPr>
-            <w:r>
-              <w:rPr>
-                <w:sz w:val="16"/>
-              </w:rPr>
-              <w:t xml:space="preserve">Only matching recipes remain; cards show photo, source, title, author</w:t>
-            </w:r>
-          </w:p>
-        </w:tc>
-      </w:tr>
-      <w:tr>
-        <w:tc>
-          <w:tcPr>
-            <w:tcW w:type="dxa" w:w="1080"/>
-            <w:vAlign w:val="center"/>
-          </w:tcPr>
-          <w:p>
-            <w:pPr>
-              <w:spacing w:after="20"/>
-            </w:pPr>
-            <w:r>
-              <w:rPr>
-                <w:sz w:val="16"/>
-              </w:rPr>
-              <w:t xml:space="preserve">AT-23</w:t>
-            </w:r>
-          </w:p>
-        </w:tc>
-        <w:tc>
-          <w:tcPr>
-            <w:tcW w:type="dxa" w:w="2880"/>
-            <w:vAlign w:val="center"/>
-          </w:tcPr>
-          <w:p>
-            <w:pPr>
-              <w:spacing w:after="20"/>
-            </w:pPr>
-            <w:r>
-              <w:rPr>
-                <w:sz w:val="16"/>
-              </w:rPr>
-              <w:t xml:space="preserve">Save a recipe from a recipe-site link</w:t>
-            </w:r>
-          </w:p>
-        </w:tc>
-        <w:tc>
-          <w:tcPr>
-            <w:tcW w:type="dxa" w:w="5256"/>
-            <w:vAlign w:val="center"/>
-          </w:tcPr>
-          <w:p>
-            <w:pPr>
-              <w:spacing w:after="20"/>
-            </w:pPr>
-            <w:r>
-              <w:rPr>
-                <w:sz w:val="16"/>
-              </w:rPr>
-              <w:t xml:space="preserve">Title, photo, ingredients and steps filled for review; “Check this import” shown</w:t>
-            </w:r>
-          </w:p>
-        </w:tc>
-      </w:tr>
-      <w:tr>
-        <w:tc>
-          <w:tcPr>
-            <w:tcW w:type="dxa" w:w="1080"/>
-            <w:vAlign w:val="center"/>
-          </w:tcPr>
-          <w:p>
-            <w:pPr>
-              <w:spacing w:after="20"/>
-            </w:pPr>
-            <w:r>
-              <w:rPr>
-                <w:sz w:val="16"/>
-              </w:rPr>
-              <w:t xml:space="preserve">AT-24</w:t>
-            </w:r>
-          </w:p>
-        </w:tc>
-        <w:tc>
-          <w:tcPr>
-            <w:tcW w:type="dxa" w:w="2880"/>
-            <w:vAlign w:val="center"/>
-          </w:tcPr>
-          <w:p>
-            <w:pPr>
-              <w:spacing w:after="20"/>
-            </w:pPr>
-            <w:r>
-              <w:rPr>
-                <w:sz w:val="16"/>
-              </w:rPr>
-              <w:t xml:space="preserve">Add to Groceries at 8 servings</w:t>
-            </w:r>
-          </w:p>
-        </w:tc>
-        <w:tc>
-          <w:tcPr>
-            <w:tcW w:type="dxa" w:w="5256"/>
-            <w:vAlign w:val="center"/>
-          </w:tcPr>
-          <w:p>
-            <w:pPr>
-              <w:spacing w:after="20"/>
-            </w:pPr>
-            <w:r>
-              <w:rPr>
-                <w:sz w:val="16"/>
-              </w:rPr>
-              <w:t xml:space="preserve">Ingredients added with doubled amounts; checking off syncs to the other device</w:t>
-            </w:r>
-          </w:p>
-        </w:tc>
-      </w:tr>
-      <w:tr>
-        <w:tc>
-          <w:tcPr>
-            <w:tcW w:type="dxa" w:w="1080"/>
-            <w:vAlign w:val="center"/>
-          </w:tcPr>
-          <w:p>
-            <w:pPr>
-              <w:spacing w:after="20"/>
-            </w:pPr>
-            <w:r>
-              <w:rPr>
-                <w:sz w:val="16"/>
-              </w:rPr>
-              <w:t xml:space="preserve">AT-25</w:t>
-            </w:r>
-          </w:p>
-        </w:tc>
-        <w:tc>
-          <w:tcPr>
-            <w:tcW w:type="dxa" w:w="2880"/>
-            <w:vAlign w:val="center"/>
-          </w:tcPr>
-          <w:p>
-            <w:pPr>
-              <w:spacing w:after="20"/>
-            </w:pPr>
-            <w:r>
-              <w:rPr>
-                <w:sz w:val="16"/>
-              </w:rPr>
-              <w:t xml:space="preserve">Locked browser</w:t>
-            </w:r>
-          </w:p>
-        </w:tc>
-        <w:tc>
-          <w:tcPr>
-            <w:tcW w:type="dxa" w:w="5256"/>
-            <w:vAlign w:val="center"/>
-          </w:tcPr>
-          <w:p>
-            <w:pPr>
-              <w:spacing w:after="20"/>
-            </w:pPr>
-            <w:r>
-              <w:rPr>
-                <w:sz w:val="16"/>
-              </w:rPr>
-              <w:t xml:space="preserve">No + button or Edit; unlocking with the write key shows them</w:t>
+              <w:t xml:space="preserve">Whisk-and-spoon icon; name “Ramiya’s Recipes”</w:t>
             </w:r>
           </w:p>
         </w:tc>
@@ -3440,37 +2917,37 @@
         <w:pStyle w:val="Heading1"/>
       </w:pPr>
       <w:r>
-        <w:t xml:space="preserve">14. Requirements status and change control</w:t>
+        <w:t xml:space="preserve">12. Requirements status and change control</w:t>
       </w:r>
     </w:p>
     <w:p>
       <w:r>
-        <w:t xml:space="preserve">Recommended tracking fields: requirement ID; area; priority; status (Proposed, Approved, Implemented, Tested, Deployed, Known Issue, Queued); test reference; release; and last verified date. Code written by an AI assistant does not by itself establish that a requirement is deployed or verified.</w:t>
+        <w:t xml:space="preserve">Code written by an AI assistant does not by itself establish that a requirement is deployed or verified. Any change to the parsers, the column split, amount display or scaling must keep the shared fixtures passing (npm test), including the sweet chili chicken and the banana bread card. Any change to the write key check, the access rules or the save functions must be followed by a passing npm run check:setup against the live site.</w:t>
       </w:r>
     </w:p>
     <w:p>
       <w:r>
-        <w:t xml:space="preserve">Any change to the ingredient line parser, the paste parser, the ingredient column split, amount display or scaling must include tests covering the sweet chili chicken recipe and the worked examples in Appendix A. Any change to the write key check, the database access rules or the save functions must be followed by a passing run of scripts/check-setup.sh against the live site.</w:t>
+        <w:t xml:space="preserve">Change log, 2026-10-20 (v1.0): book page design v1 (the sweet chili chicken page).</w:t>
       </w:r>
     </w:p>
     <w:p>
       <w:r>
-        <w:t xml:space="preserve">Change log, 2026-10-20 (v1.0): milestone 2 complete in code: book-page design tokens and fonts; recipe page with spiral, side tabs, stat box, tag checkboxes, stickers, balanced ingredient columns and directions; cover page with recipe cards; category pages; sweet chili chicken hard-coded to match the reference photo. Owner decision: the login page is left out for now and queued.</w:t>
+        <w:t xml:space="preserve">Change log, 2026-10-24 to 27 (v1.1): database and save function; site live; redesign decided after the Deglaze app (docs/DESIGN.md); a native iPad app planned.</w:t>
       </w:r>
     </w:p>
     <w:p>
       <w:r>
-        <w:t xml:space="preserve">Change log, 2026-10-24: owner decision to build a native iPad app installed with SideStore and refreshed automatically, as a full recipe book (docs/APP_PLAN.md). Database schema created (migration 000, run by the owner) with public read-only access; the save-recipe function deployed with the write key.</w:t>
+        <w:t xml:space="preserve">Change log, 2026-10-28: website R1 (new look, Library, recipe view, book view), R2 (unlock, writing page, photos), R3 (Save from the web, Add from photos, Paste text), R4 (Groceries, Start Cooking, serving scaler) built and deployed.</w:t>
       </w:r>
     </w:p>
     <w:p>
       <w:r>
-        <w:t xml:space="preserve">Change log, 2026-10-27 (v1.1): website live at https://ramiyas-recipes.vercel.app, reading recipes from the database, with recipe addresses based on titles (FR-NAV-003) and pages that refresh within a minute (FR-DATA-001). Next.js upgraded to 15.5.28 and React to 19.1.10 because Vercel blocks versions affected by the React2Shell vulnerability (CVE-2025-55182). All setup checks pass; the keep-awake job runs twice a week. Owner decisions the same day: redesign both the website and the app after the Deglaze app (docs/DESIGN.md): light only, Deglaze green accent, Home book shelf, Library, recipe view in handwriting on cream, the book page as the writing page; the website adds recipes too (from the web, from photos, enter your own); one simple grocery list; less reliance on AI (published recipe data and on-device text recognition only). Specification reorganized accordingly (sections 4–12).</w:t>
+        <w:t xml:space="preserve">Change log, 2026-10-29 (v2.0): the iPad app (prototype in the Simulator) dropped; the website is the iPad experience. Pencil page mode with several pages; Home Screen icon and name; List | Book moved to the Library; cover photos shown whole; tags trimmed to five; Favorites as stars on Library cards; Home rebuilt (pick up, Surprise me, this week's meals with migration 002, groceries at a glance, to finish); category and Favorites filters on the Library; Type the lines for handwritten-only recipes; book cover as the icon. Built, not yet deployed: paste rules for handwritten cards, offline, live updates (migration 003). Safari on iPad made the primary browser.</w:t>
       </w:r>
     </w:p>
     <w:p>
       <w:r>
-        <w:t xml:space="preserve">Queued (not scheduled): sign-in (FR-AUTH-001: Supabase Auth, replacing the write key); per-person privacy and family sharing (FR-AUTH-002: an optional shared flag once sign-in exists); custom handwriting font made from the owner's handwriting (Calligraphr or iFontMaker) replacing Patrick Hand; instant website refresh after a save; a Share-sheet extension for the app.</w:t>
+        <w:t xml:space="preserve">Queued (not scheduled): sign-in (FR-AUTH-001, Supabase Auth replacing the write key) and family sharing (FR-AUTH-002); the owner's own handwriting font; the write key as a passphrase; Next.js 16. Decision pending: full-screen Home Screen app (FR-PWA-002).</w:t>
       </w:r>
     </w:p>
     <w:p>
@@ -3542,42 +3019,6 @@
               <w:rPr>
                 <w:sz w:val="16"/>
               </w:rPr>
-              <w:t xml:space="preserve">Column split</w:t>
-            </w:r>
-          </w:p>
-        </w:tc>
-        <w:tc>
-          <w:tcPr>
-            <w:tcW w:type="dxa" w:w="6912"/>
-            <w:vAlign w:val="center"/>
-          </w:tcPr>
-          <w:p>
-            <w:pPr>
-              <w:spacing w:after="20"/>
-            </w:pPr>
-            <w:r>
-              <w:rPr>
-                <w:sz w:val="16"/>
-              </w:rPr>
-              <w:t xml:space="preserve">Groups of 8, 7 and 1 lines (names included): first group fills the left column to half of 16 lines, so the other two go right with a blank line between them.</w:t>
-            </w:r>
-          </w:p>
-        </w:tc>
-      </w:tr>
-      <w:tr>
-        <w:tc>
-          <w:tcPr>
-            <w:tcW w:type="dxa" w:w="2304"/>
-            <w:vAlign w:val="center"/>
-          </w:tcPr>
-          <w:p>
-            <w:pPr>
-              <w:spacing w:after="20"/>
-            </w:pPr>
-            <w:r>
-              <w:rPr>
-                <w:sz w:val="16"/>
-              </w:rPr>
               <w:t xml:space="preserve">No amount</w:t>
             </w:r>
           </w:p>
@@ -3595,7 +3036,7 @@
               <w:rPr>
                 <w:sz w:val="16"/>
               </w:rPr>
-              <w:t xml:space="preserve">“pinch of salt”: amount and unit empty; shown exactly as written; unchanged by scaling.</w:t>
+              <w:t xml:space="preserve">“pinch of salt”: amount and unit empty; shown as written; unchanged by scaling.</w:t>
             </w:r>
           </w:p>
         </w:tc>
@@ -3631,7 +3072,7 @@
               <w:rPr>
                 <w:sz w:val="16"/>
               </w:rPr>
-              <w:t xml:space="preserve">Stored “1/3” shows as ⅓; stored “1 1/2” shows as 1 ½.</w:t>
+              <w:t xml:space="preserve">“1/3” shows ⅓; “1 1/2” shows 1 ½.</w:t>
             </w:r>
           </w:p>
         </w:tc>
@@ -3650,7 +3091,7 @@
               <w:rPr>
                 <w:sz w:val="16"/>
               </w:rPr>
-              <w:t xml:space="preserve">Mixed number scaling</w:t>
+              <w:t xml:space="preserve">Scaling</w:t>
             </w:r>
           </w:p>
         </w:tc>
@@ -3667,7 +3108,7 @@
               <w:rPr>
                 <w:sz w:val="16"/>
               </w:rPr>
-              <w:t xml:space="preserve">“1 1/2 c flour” at double servings shows “3 c flour”.</w:t>
+              <w:t xml:space="preserve">“1/3 c” × 1.5 = “1/2 c”; “1/3” × ½ = “1/6”; “2-3” × 1.5 = “3-4 1/2”.</w:t>
             </w:r>
           </w:p>
         </w:tc>
@@ -3686,7 +3127,7 @@
               <w:rPr>
                 <w:sz w:val="16"/>
               </w:rPr>
-              <w:t xml:space="preserve">Paste: group name</w:t>
+              <w:t xml:space="preserve">Paste: misread grams</w:t>
             </w:r>
           </w:p>
         </w:tc>
@@ -3703,7 +3144,7 @@
               <w:rPr>
                 <w:sz w:val="16"/>
               </w:rPr>
-              <w:t xml:space="preserve">A short line “marinade” with no amount inside the ingredient area starts a group.</w:t>
+              <w:t xml:space="preserve">In a recipe with other gram amounts, “1709 unsalted butter” → 170 g; “3400 mashed bananas” → 340 g; “6q vanilla paste” → 6 g; “30 almonds” is left alone.</w:t>
             </w:r>
           </w:p>
         </w:tc>
@@ -3722,7 +3163,7 @@
               <w:rPr>
                 <w:sz w:val="16"/>
               </w:rPr>
-              <w:t xml:space="preserve">Paste: sub-step</w:t>
+              <w:t xml:space="preserve">Paste: run-together line</w:t>
             </w:r>
           </w:p>
         </w:tc>
@@ -3739,7 +3180,7 @@
               <w:rPr>
                 <w:sz w:val="16"/>
               </w:rPr>
-              <w:t xml:space="preserve">“- lightly oil the surface” after “▷ cook chicken” becomes a sub-step of that step.</w:t>
+              <w:t xml:space="preserve">“20z maple syzup cream butteR 3 sugaR mash? mix in bananas mix in liguids” → “2 oz maple syzup”, then steps “cream butter 3 sugar”, “mash &amp; mix in bananas”, “mix in liguids”; “…over low heat” is not split.</w:t>
             </w:r>
           </w:p>
         </w:tc>
@@ -3758,7 +3199,7 @@
               <w:rPr>
                 <w:sz w:val="16"/>
               </w:rPr>
-              <w:t xml:space="preserve">Paste: unclear line</w:t>
+              <w:t xml:space="preserve">Paste: misread line</w:t>
             </w:r>
           </w:p>
         </w:tc>
@@ -3775,7 +3216,7 @@
               <w:rPr>
                 <w:sz w:val="16"/>
               </w:rPr>
-              <w:t xml:space="preserve">A line that fits no rule (“from Grandma, 1998”) goes into Notes.</w:t>
+              <w:t xml:space="preserve">“Bg baking soda” between two amount lines stays an ingredient (no amount).</w:t>
             </w:r>
           </w:p>
         </w:tc>
@@ -3794,7 +3235,7 @@
               <w:rPr>
                 <w:sz w:val="16"/>
               </w:rPr>
-              <w:t xml:space="preserve">Total time</w:t>
+              <w:t xml:space="preserve">Paste: step start</w:t>
             </w:r>
           </w:p>
         </w:tc>
@@ -3811,7 +3252,7 @@
               <w:rPr>
                 <w:sz w:val="16"/>
               </w:rPr>
-              <w:t xml:space="preserve">Prep 45 and cook 15 show 60 min; prep only 20 shows 20 min; neither shows no time.</w:t>
+              <w:t xml:space="preserve">“cream butter &amp; sugar” starts the steps even though it names ingredients.</w:t>
             </w:r>
           </w:p>
         </w:tc>
@@ -3830,7 +3271,7 @@
               <w:rPr>
                 <w:sz w:val="16"/>
               </w:rPr>
-              <w:t xml:space="preserve">Renamed recipe</w:t>
+              <w:t xml:space="preserve">Paste: capitals</w:t>
             </w:r>
           </w:p>
         </w:tc>
@@ -3847,7 +3288,7 @@
               <w:rPr>
                 <w:sz w:val="16"/>
               </w:rPr>
-              <w:t xml:space="preserve">“sweet chili chicken” renamed “Sweet Chili Chicken!” keeps /recipe/sweet-chili-chicken.</w:t>
+              <w:t xml:space="preserve">“bUtteR” → “butter”; “McCormick” kept.</w:t>
             </w:r>
           </w:p>
         </w:tc>
@@ -3866,7 +3307,7 @@
               <w:rPr>
                 <w:sz w:val="16"/>
               </w:rPr>
-              <w:t xml:space="preserve">Wrong write key</w:t>
+              <w:t xml:space="preserve">Week to Groceries</w:t>
             </w:r>
           </w:p>
         </w:tc>
@@ -3883,7 +3324,7 @@
               <w:rPr>
                 <w:sz w:val="16"/>
               </w:rPr>
-              <w:t xml:space="preserve">Save refused with “Unauthorized”; the app keeps the recipe on the iPad to retry.</w:t>
+              <w:t xml:space="preserve">A recipe for 4 planned for 6 adds its ingredients × 1.5.</w:t>
             </w:r>
           </w:p>
         </w:tc>
@@ -3902,7 +3343,7 @@
               <w:rPr>
                 <w:sz w:val="16"/>
               </w:rPr>
-              <w:t xml:space="preserve">Link without recipe data</w:t>
+              <w:t xml:space="preserve">Continue cooking</w:t>
             </w:r>
           </w:p>
         </w:tc>
@@ -3919,7 +3360,7 @@
               <w:rPr>
                 <w:sz w:val="16"/>
               </w:rPr>
-              <w:t xml:space="preserve">Writing page opens with the link as source and the page title as title; everything else is entered by hand.</w:t>
+              <w:t xml:space="preserve">Left at step 2 at ×1.5 more than a day ago: Home shows Last opened instead.</w:t>
             </w:r>
           </w:p>
         </w:tc>
@@ -3938,7 +3379,7 @@
               <w:rPr>
                 <w:sz w:val="16"/>
               </w:rPr>
-              <w:t xml:space="preserve">Groceries at double servings</w:t>
+              <w:t xml:space="preserve">Offline check-off</w:t>
             </w:r>
           </w:p>
         </w:tc>
@@ -3955,7 +3396,7 @@
               <w:rPr>
                 <w:sz w:val="16"/>
               </w:rPr>
-              <w:t xml:space="preserve">“1/3 c sweet chili sauce” is added as “⅔ c sweet chili sauce”.</w:t>
+              <w:t xml:space="preserve">Checked offline, page reloaded offline: still checked; sent when online.</w:t>
             </w:r>
           </w:p>
         </w:tc>
@@ -3974,7 +3415,7 @@
               <w:rPr>
                 <w:sz w:val="16"/>
               </w:rPr>
-              <w:t xml:space="preserve">Missed refreshes</w:t>
+              <w:t xml:space="preserve">Handwritten-only</w:t>
             </w:r>
           </w:p>
         </w:tc>
@@ -3991,7 +3432,7 @@
               <w:rPr>
                 <w:sz w:val="16"/>
               </w:rPr>
-              <w:t xml:space="preserve">iPad off for 8 days: the app won't open until SideStore refreshes it; no recipes are lost and the website still works.</w:t>
+              <w:t xml:space="preserve">Pencil pages, no lines: no Start Cooking; Type the lines shown; book page shows the handwritten page.</w:t>
             </w:r>
           </w:p>
         </w:tc>
@@ -4008,22 +3449,22 @@
     </w:p>
     <w:p>
       <w:r>
-        <w:t xml:space="preserve">1. Edit the relevant files in VS Code or Xcode. Database changes are new migration files with a rollback script, run by the owner in the Supabase SQL Editor after a backup.</w:t>
+        <w:t xml:space="preserve">1. Edit the files in VS Code. Database changes are new migration files with a rollback script, tested in PGlite and run by the owner in the Supabase SQL Editor.</w:t>
       </w:r>
     </w:p>
     <w:p>
       <w:r>
-        <w:t xml:space="preserve">2. Website: run npm run dev and test on http://localhost:3000, comparing recipe pages with the reference photo. App: run it on the iPad from Xcode or install a test build through SideStore.</w:t>
+        <w:t xml:space="preserve">2. Run npm run dev and test on http://localhost:3000, and on the iPad at the Mac's address on port 3000. Offline and live updates only work in a production build (or the deployed site).</w:t>
       </w:r>
     </w:p>
     <w:p>
       <w:r>
-        <w:t xml:space="preserve">3. Run npm run lint and npm run build (and the app's Swift tests once they exist); after backend changes, run npm run check:setup https://ramiyas-recipes.vercel.app. Passing these does not replace the manual checks above.</w:t>
+        <w:t xml:space="preserve">3. Run npm run lint, npm test and a production build in a copy of the project (never next build while the dev server runs); check in WebKit with an iPad profile. After backend changes, run npm run check:setup https://ramiyas-recipes.vercel.app.</w:t>
       </w:r>
     </w:p>
     <w:p>
       <w:r>
-        <w:t xml:space="preserve">4. The owner commits and pushes to GitHub (jaylouissaint/recipe-book); Vercel builds and deploys the website from main. For the app, the owner pushes a version tag and SideStore offers the update (iPad app Phase 6; until then, builds are installed through SideStore by hand).</w:t>
+        <w:t xml:space="preserve">4. The owner commits and pushes to GitHub (jaylouissaint/recipe-book); Vercel deploys main.</w:t>
       </w:r>
     </w:p>
     <w:sectPr>
@@ -4048,7 +3489,7 @@
       <w:rPr>
         <w:sz w:val="16"/>
       </w:rPr>
-      <w:t>Recipe Book  |  Functional Specification  |  Draft v1.1</w:t>
+      <w:t>Recipe Book  |  Functional Specification  |  Draft v2.0</w:t>
     </w:r>
   </w:p>
 </w:ftr>

</xml_diff>

<commit_message>
Adding to the app feel of the website
</commit_message>
<xml_diff>
--- a/Specification Documentation/Recipe_Book_Functional_Specification.docx
+++ b/Specification Documentation/Recipe_Book_Functional_Specification.docx
@@ -385,7 +385,7 @@
     </w:p>
     <w:p>
       <w:r>
-        <w:t xml:space="preserve">Added to the iPad Home Screen (Share → Add to Home Screen), the site shows the whisk-and-wooden-spoon icon and the name “Ramiya’s Recipes”. It opens in Safari (full-screen standalone mode is a decision pending, FR-PWA-002).</w:t>
+        <w:t xml:space="preserve">Added to the iPad Home Screen (Share → Add to Home Screen), the site shows the whisk-and-wooden-spoon icon and the name “Ramiya’s Recipes”, and opens full screen like an app (FR-PWA-002).</w:t>
       </w:r>
     </w:p>
     <w:p>
@@ -1689,22 +1689,22 @@
         <w:pStyle w:val="Heading2"/>
       </w:pPr>
       <w:r>
-        <w:t xml:space="preserve">FR-PWA-002  Full-screen Home Screen app (decision pending)</w:t>
+        <w:t xml:space="preserve">FR-PWA-002  Full-screen Home Screen app</w:t>
       </w:r>
     </w:p>
     <w:p>
       <w:r>
-        <w:t xml:space="preserve">Opening the Home Screen shortcut as a full-screen app without Safari's address bar. Under consideration; see the Technical Specification, section 8.</w:t>
+        <w:t xml:space="preserve">The Home Screen shortcut opens full screen, without Safari's address bar and buttons, with its own entry in the app switcher. The site's own tabs, back buttons and × get around; Cancel on the writing page goes back, or to the recipe (or the Library) when there's nothing to go back to. Links to other websites open separately. The full-screen app keeps its own storage apart from Safari: editing is unlocked once inside it, and its offline copies fill as pages are opened there.</w:t>
       </w:r>
     </w:p>
     <w:p>
       <w:r>
-        <w:t xml:space="preserve">Acceptance: Not specified until decided.</w:t>
+        <w:t xml:space="preserve">Acceptance: Opened from the shortcut, no address bar shows; every page has a way back; Unlock editing in its Settings works.</w:t>
       </w:r>
     </w:p>
     <w:p>
       <w:r>
-        <w:t xml:space="preserve">Verification status: Proposed (website step R5)</w:t>
+        <w:t xml:space="preserve">Verification status: Built 2026-10-29, not yet deployed; checked in WebKit with an iPad profile (and headless Chrome); owner check pending (decided by the owner 2026-10-29)</w:t>
       </w:r>
     </w:p>
     <w:p>
@@ -2905,7 +2905,7 @@
               <w:rPr>
                 <w:sz w:val="16"/>
               </w:rPr>
-              <w:t xml:space="preserve">Whisk-and-spoon icon; name “Ramiya’s Recipes”</w:t>
+              <w:t xml:space="preserve">Whisk-and-spoon icon; name “Ramiya’s Recipes”; opens full screen</w:t>
             </w:r>
           </w:p>
         </w:tc>
@@ -2942,12 +2942,12 @@
     </w:p>
     <w:p>
       <w:r>
-        <w:t xml:space="preserve">Change log, 2026-10-29 (v2.0): the iPad app (prototype in the Simulator) dropped; the website is the iPad experience. Pencil page mode with several pages; Home Screen icon and name; List | Book moved to the Library; cover photos shown whole; tags trimmed to five; Favorites as stars on Library cards; Home rebuilt (pick up, Surprise me, this week's meals with migration 002, groceries at a glance, to finish); category and Favorites filters on the Library; Type the lines for handwritten-only recipes; book cover as the icon. Built, not yet deployed: paste rules for handwritten cards, offline, live updates (migration 003). Safari on iPad made the primary browser.</w:t>
+        <w:t xml:space="preserve">Change log, 2026-10-29 (v2.0): the iPad app (prototype in the Simulator) dropped; the website is the iPad experience. Pencil page mode with several pages; Home Screen icon and name; List | Book moved to the Library; cover photos shown whole; tags trimmed to five; Favorites as stars on Library cards; Home rebuilt (pick up, Surprise me, this week's meals with migration 002, groceries at a glance, to finish); category and Favorites filters on the Library; Type the lines for handwritten-only recipes; book cover as the icon. Built, not yet deployed: paste rules for handwritten cards, offline, live updates (migration 003), the full-screen Home Screen app. Safari on iPad made the primary browser.</w:t>
       </w:r>
     </w:p>
     <w:p>
       <w:r>
-        <w:t xml:space="preserve">Queued (not scheduled): sign-in (FR-AUTH-001, Supabase Auth replacing the write key) and family sharing (FR-AUTH-002); the owner's own handwriting font; the write key as a passphrase; Next.js 16. Decision pending: full-screen Home Screen app (FR-PWA-002).</w:t>
+        <w:t xml:space="preserve">Queued (not scheduled): sign-in (FR-AUTH-001, Supabase Auth replacing the write key) and family sharing (FR-AUTH-002); the owner's own handwriting font; the write key as a passphrase; Next.js 16.</w:t>
       </w:r>
     </w:p>
     <w:p>

</xml_diff>

<commit_message>
Adding to the app feel of the website2
</commit_message>
<xml_diff>
--- a/Specification Documentation/Recipe_Book_Functional_Specification.docx
+++ b/Specification Documentation/Recipe_Book_Functional_Specification.docx
@@ -316,17 +316,17 @@
     </w:p>
     <w:p>
       <w:r>
-        <w:t xml:space="preserve">Home, Library, Groceries and Settings: a bottom tab bar on phones and iPad portrait, a left sidebar on iPad landscape and desktops. A floating green + button (unlocked only) opens Add a recipe.</w:t>
+        <w:t xml:space="preserve">Home, Library, Groceries and Settings. On iPad and wider: a floating capsule at the top centre, like iPadOS's tab bar, with the current tab as a white pill and a sidebar button that moves the menu to a left sidebar (and back); remembered per browser and applied before the page is drawn. On phones: a bottom tab bar. The tapped tab lights up at once and every tab opens instantly (cached pages, refreshed on every change). A floating green + button (unlocked only) opens Add a recipe.</w:t>
       </w:r>
     </w:p>
     <w:p>
       <w:r>
-        <w:t xml:space="preserve">Acceptance: Each tab opens its page and is highlighted; the book view and recipe pages highlight Library.</w:t>
+        <w:t xml:space="preserve">Acceptance: Each tab opens its page and is highlighted; the book view and recipe pages highlight Library; the menu's place survives a reload; a tab lights up within 100 ms of a tap.</w:t>
       </w:r>
     </w:p>
     <w:p>
       <w:r>
-        <w:t xml:space="preserve">Verification status: Deployed at https://ramiyas-recipes.vercel.app (main at 19be9f4, 2026-10-29); checked in WebKit with an iPad profile and in headless Chrome; owner check on the iPad pending</w:t>
+        <w:t xml:space="preserve">Verification status: Built 2026-10-29, not yet deployed; checked in WebKit with an iPad profile (and headless Chrome); owner check pending</w:t>
       </w:r>
     </w:p>
     <w:p>
@@ -992,7 +992,7 @@
     </w:p>
     <w:p>
       <w:r>
-        <w:t xml:space="preserve">Home is the page opened before cooking or shopping (changed 2026-10-29; it was a book shelf). Browsing is the Library's job (Section 5). Home always loads fresh.</w:t>
+        <w:t xml:space="preserve">Home is the page opened before cooking or shopping (changed 2026-10-29; it was a book shelf). Browsing is the Library's job (Section 5). Like every page it opens instantly from the site's cache, which every change refreshes at once.</w:t>
       </w:r>
     </w:p>
     <w:p>
@@ -2947,7 +2947,7 @@
     </w:p>
     <w:p>
       <w:r>
-        <w:t xml:space="preserve">Queued (not scheduled): sign-in (FR-AUTH-001, Supabase Auth replacing the write key) and family sharing (FR-AUTH-002); the owner's own handwriting font; the write key as a passphrase; Next.js 16.</w:t>
+        <w:t xml:space="preserve">Queued (not scheduled): a second book for the owner's partner (“Who's using this”: Ramiya / Jay in Settings, each book with its own recipes, groceries and week; or via sign-in); sign-in (FR-AUTH-001, Supabase Auth replacing the write key) and family sharing (FR-AUTH-002); the owner's own handwriting font; the write key as a passphrase; Next.js 16.</w:t>
       </w:r>
     </w:p>
     <w:p>

</xml_diff>

<commit_message>
Adding handwriting and fixes
</commit_message>
<xml_diff>
--- a/Specification Documentation/Recipe_Book_Functional_Specification.docx
+++ b/Specification Documentation/Recipe_Book_Functional_Specification.docx
@@ -507,7 +507,7 @@
               <w:rPr>
                 <w:sz w:val="16"/>
               </w:rPr>
-              <w:t xml:space="preserve">Anything the cook wrote (title, amounts, ingredients, steps, notes, stat values). Shown in the handwriting font (Patrick Hand, until the owner's own font) in plum ink.</w:t>
+              <w:t xml:space="preserve">Anything the cook wrote (title, amounts, ingredients, steps, notes, stat values). Shown in plum ink in the handwriting font: Ramiya's own handwriting in her book (Patrick Hand for punctuation and fractions it lacks), Patrick Hand in Jay's.</w:t>
             </w:r>
           </w:p>
         </w:tc>
@@ -3021,7 +3021,12 @@
     </w:p>
     <w:p>
       <w:r>
-        <w:t xml:space="preserve">Queued (not scheduled): the owner's own handwriting font; the write keys as passphrases; Next.js 16; optionally a custom book cover.</w:t>
+        <w:t xml:space="preserve">Change log, 2026-10-30 (later): Ramiya's own handwriting font for recipe content in her book (Patrick Hand for missing characters and in Jay's book); Home compacted for iPhones; more room under the phone tab bar.</w:t>
+      </w:r>
+    </w:p>
+    <w:p>
+      <w:r>
+        <w:t xml:space="preserve">Queued (not scheduled): the write keys as passphrases; Next.js 16; optionally a custom book cover.</w:t>
       </w:r>
     </w:p>
     <w:p>

</xml_diff>